<commit_message>
Here 'Ali Abbas' Uploaded the final 'Logical Model' for the database
</commit_message>
<xml_diff>
--- a/docs/SRS - LBMS (DBCD).docx
+++ b/docs/SRS - LBMS (DBCD).docx
@@ -3481,6 +3481,87 @@
     </w:p>
     <w:p>
       <w:r>
+        <w:rPr>
+          <w:noProof/>
+        </w:rPr>
+        <w:drawing>
+          <wp:anchor distT="0" distB="0" distL="114300" distR="114300" simplePos="0" relativeHeight="251659264" behindDoc="0" locked="0" layoutInCell="1" allowOverlap="1" wp14:anchorId="6C60ABB6" wp14:editId="02078DA8">
+            <wp:simplePos x="0" y="0"/>
+            <wp:positionH relativeFrom="column">
+              <wp:posOffset>363</wp:posOffset>
+            </wp:positionH>
+            <wp:positionV relativeFrom="paragraph">
+              <wp:posOffset>526959</wp:posOffset>
+            </wp:positionV>
+            <wp:extent cx="5596890" cy="5676900"/>
+            <wp:effectExtent l="0" t="0" r="3810" b="0"/>
+            <wp:wrapThrough wrapText="bothSides">
+              <wp:wrapPolygon edited="0">
+                <wp:start x="0" y="0"/>
+                <wp:lineTo x="0" y="21528"/>
+                <wp:lineTo x="21541" y="21528"/>
+                <wp:lineTo x="21541" y="0"/>
+                <wp:lineTo x="0" y="0"/>
+              </wp:wrapPolygon>
+            </wp:wrapThrough>
+            <wp:docPr id="1877656120" name="صورة 1">
+              <a:hlinkClick xmlns:a="http://schemas.openxmlformats.org/drawingml/2006/main" r:id="rId11"/>
+            </wp:docPr>
+            <wp:cNvGraphicFramePr>
+              <a:graphicFrameLocks xmlns:a="http://schemas.openxmlformats.org/drawingml/2006/main" noChangeAspect="1"/>
+            </wp:cNvGraphicFramePr>
+            <a:graphic xmlns:a="http://schemas.openxmlformats.org/drawingml/2006/main">
+              <a:graphicData uri="http://schemas.openxmlformats.org/drawingml/2006/picture">
+                <pic:pic xmlns:pic="http://schemas.openxmlformats.org/drawingml/2006/picture">
+                  <pic:nvPicPr>
+                    <pic:cNvPr id="1877656120" name="صورة 1">
+                      <a:hlinkClick r:id="rId11"/>
+                    </pic:cNvPr>
+                    <pic:cNvPicPr/>
+                  </pic:nvPicPr>
+                  <pic:blipFill rotWithShape="1">
+                    <a:blip r:embed="rId12">
+                      <a:extLst>
+                        <a:ext uri="{28A0092B-C50C-407E-A947-70E740481C1C}">
+                          <a14:useLocalDpi xmlns:a14="http://schemas.microsoft.com/office/drawing/2010/main" val="0"/>
+                        </a:ext>
+                      </a:extLst>
+                    </a:blip>
+                    <a:srcRect l="25992" r="18542"/>
+                    <a:stretch>
+                      <a:fillRect/>
+                    </a:stretch>
+                  </pic:blipFill>
+                  <pic:spPr bwMode="auto">
+                    <a:xfrm>
+                      <a:off x="0" y="0"/>
+                      <a:ext cx="5596890" cy="5676900"/>
+                    </a:xfrm>
+                    <a:prstGeom prst="rect">
+                      <a:avLst/>
+                    </a:prstGeom>
+                    <a:ln>
+                      <a:noFill/>
+                    </a:ln>
+                    <a:extLst>
+                      <a:ext uri="{53640926-AAD7-44D8-BBD7-CCE9431645EC}">
+                        <a14:shadowObscured xmlns:a14="http://schemas.microsoft.com/office/drawing/2010/main"/>
+                      </a:ext>
+                    </a:extLst>
+                  </pic:spPr>
+                </pic:pic>
+              </a:graphicData>
+            </a:graphic>
+            <wp14:sizeRelH relativeFrom="page">
+              <wp14:pctWidth>0</wp14:pctWidth>
+            </wp14:sizeRelH>
+            <wp14:sizeRelV relativeFrom="page">
+              <wp14:pctHeight>0</wp14:pctHeight>
+            </wp14:sizeRelV>
+          </wp:anchor>
+        </w:drawing>
+      </w:r>
+      <w:r>
         <w:br w:type="page"/>
       </w:r>
     </w:p>
@@ -7801,8 +7882,8 @@
       </w:pPr>
     </w:p>
     <w:sectPr>
-      <w:headerReference w:type="default" r:id="rId11"/>
-      <w:footerReference w:type="default" r:id="rId12"/>
+      <w:headerReference w:type="default" r:id="rId13"/>
+      <w:footerReference w:type="default" r:id="rId14"/>
       <w:pgSz w:w="12240" w:h="15840"/>
       <w:pgMar w:top="1440" w:right="1800" w:bottom="1440" w:left="1800" w:header="720" w:footer="720" w:gutter="0"/>
       <w:cols w:space="720"/>

</xml_diff>

<commit_message>
Here Ali Abbass put the Queries, and I deleted the points that the Dr deleted from the project requirenments because of the time
</commit_message>
<xml_diff>
--- a/docs/SRS - LBMS (DBCD).docx
+++ b/docs/SRS - LBMS (DBCD).docx
@@ -158,13 +158,13 @@
     </w:p>
     <w:p>
       <w:pPr>
-        <w:pStyle w:val="Title"/>
+        <w:pStyle w:val="a3"/>
         <w:jc w:val="center"/>
       </w:pPr>
     </w:p>
     <w:p>
       <w:pPr>
-        <w:pStyle w:val="Title"/>
+        <w:pStyle w:val="a3"/>
         <w:jc w:val="center"/>
       </w:pPr>
       <w:r>
@@ -276,7 +276,7 @@
     <w:p/>
     <w:tbl>
       <w:tblPr>
-        <w:tblStyle w:val="TableGrid"/>
+        <w:tblStyle w:val="a7"/>
         <w:tblW w:w="9229" w:type="dxa"/>
         <w:jc w:val="center"/>
         <w:tblLook w:val="04A0" w:firstRow="1" w:lastRow="0" w:firstColumn="1" w:lastColumn="0" w:noHBand="0" w:noVBand="1"/>
@@ -766,7 +766,7 @@
       <w:sdtContent>
         <w:p>
           <w:pPr>
-            <w:pStyle w:val="Heading2"/>
+            <w:pStyle w:val="2"/>
           </w:pPr>
           <w:r>
             <w:t>Table of Contents</w:t>
@@ -775,7 +775,7 @@
         </w:p>
         <w:p>
           <w:pPr>
-            <w:pStyle w:val="TOC2"/>
+            <w:pStyle w:val="20"/>
             <w:tabs>
               <w:tab w:val="right" w:leader="dot" w:pos="8630"/>
             </w:tabs>
@@ -853,7 +853,7 @@
         </w:p>
         <w:p>
           <w:pPr>
-            <w:pStyle w:val="TOC1"/>
+            <w:pStyle w:val="10"/>
             <w:tabs>
               <w:tab w:val="left" w:pos="440"/>
               <w:tab w:val="right" w:leader="dot" w:pos="8630"/>
@@ -937,7 +937,7 @@
         </w:p>
         <w:p>
           <w:pPr>
-            <w:pStyle w:val="TOC1"/>
+            <w:pStyle w:val="10"/>
             <w:tabs>
               <w:tab w:val="left" w:pos="440"/>
               <w:tab w:val="right" w:leader="dot" w:pos="8630"/>
@@ -1021,7 +1021,7 @@
         </w:p>
         <w:p>
           <w:pPr>
-            <w:pStyle w:val="TOC2"/>
+            <w:pStyle w:val="20"/>
             <w:tabs>
               <w:tab w:val="right" w:leader="dot" w:pos="8630"/>
             </w:tabs>
@@ -1090,7 +1090,7 @@
         </w:p>
         <w:p>
           <w:pPr>
-            <w:pStyle w:val="TOC2"/>
+            <w:pStyle w:val="20"/>
             <w:tabs>
               <w:tab w:val="right" w:leader="dot" w:pos="8630"/>
             </w:tabs>
@@ -1159,7 +1159,7 @@
         </w:p>
         <w:p>
           <w:pPr>
-            <w:pStyle w:val="TOC2"/>
+            <w:pStyle w:val="20"/>
             <w:tabs>
               <w:tab w:val="right" w:leader="dot" w:pos="8630"/>
             </w:tabs>
@@ -1228,7 +1228,7 @@
         </w:p>
         <w:p>
           <w:pPr>
-            <w:pStyle w:val="TOC1"/>
+            <w:pStyle w:val="10"/>
             <w:tabs>
               <w:tab w:val="left" w:pos="440"/>
               <w:tab w:val="right" w:leader="dot" w:pos="8630"/>
@@ -1312,7 +1312,7 @@
         </w:p>
         <w:p>
           <w:pPr>
-            <w:pStyle w:val="TOC1"/>
+            <w:pStyle w:val="10"/>
             <w:tabs>
               <w:tab w:val="left" w:pos="440"/>
               <w:tab w:val="right" w:leader="dot" w:pos="8630"/>
@@ -1396,7 +1396,7 @@
         </w:p>
         <w:p>
           <w:pPr>
-            <w:pStyle w:val="TOC1"/>
+            <w:pStyle w:val="10"/>
             <w:tabs>
               <w:tab w:val="left" w:pos="440"/>
               <w:tab w:val="right" w:leader="dot" w:pos="8630"/>
@@ -1480,7 +1480,7 @@
         </w:p>
         <w:p>
           <w:pPr>
-            <w:pStyle w:val="TOC1"/>
+            <w:pStyle w:val="10"/>
             <w:tabs>
               <w:tab w:val="left" w:pos="440"/>
               <w:tab w:val="right" w:leader="dot" w:pos="8630"/>
@@ -1564,7 +1564,7 @@
         </w:p>
         <w:p>
           <w:pPr>
-            <w:pStyle w:val="TOC1"/>
+            <w:pStyle w:val="10"/>
             <w:tabs>
               <w:tab w:val="left" w:pos="440"/>
               <w:tab w:val="right" w:leader="dot" w:pos="8630"/>
@@ -1650,7 +1650,7 @@
         </w:p>
         <w:p>
           <w:pPr>
-            <w:pStyle w:val="TOC1"/>
+            <w:pStyle w:val="10"/>
             <w:tabs>
               <w:tab w:val="left" w:pos="440"/>
               <w:tab w:val="right" w:leader="dot" w:pos="8630"/>
@@ -1782,7 +1782,7 @@
     </w:p>
     <w:p>
       <w:pPr>
-        <w:pStyle w:val="Heading1"/>
+        <w:pStyle w:val="1"/>
       </w:pPr>
       <w:bookmarkStart w:id="1" w:name="_Toc410819652"/>
       <w:r>
@@ -1802,7 +1802,6 @@
       <w:r>
         <w:t xml:space="preserve">To effectively manage and optimize its operations, the </w:t>
       </w:r>
-      <w:proofErr w:type="gramStart"/>
       <w:r>
         <w:rPr>
           <w:b/>
@@ -1810,7 +1809,6 @@
         </w:rPr>
         <w:t>Library</w:t>
       </w:r>
-      <w:proofErr w:type="gramEnd"/>
       <w:r>
         <w:t xml:space="preserve"> requires a robust system that consolidates and tracks crucial information about its </w:t>
       </w:r>
@@ -1989,7 +1987,7 @@
     </w:p>
     <w:p>
       <w:pPr>
-        <w:pStyle w:val="Heading1"/>
+        <w:pStyle w:val="1"/>
       </w:pPr>
       <w:bookmarkStart w:id="3" w:name="_Toc410819653"/>
       <w:bookmarkStart w:id="4" w:name="_Toc33350367"/>
@@ -2002,7 +2000,7 @@
     </w:p>
     <w:p>
       <w:pPr>
-        <w:pStyle w:val="Heading2"/>
+        <w:pStyle w:val="2"/>
       </w:pPr>
       <w:r>
         <w:t xml:space="preserve">2.1 Requirement Specification </w:t>
@@ -2010,7 +2008,7 @@
     </w:p>
     <w:p>
       <w:pPr>
-        <w:pStyle w:val="ListParagraph"/>
+        <w:pStyle w:val="aa"/>
         <w:numPr>
           <w:ilvl w:val="0"/>
           <w:numId w:val="19"/>
@@ -2086,7 +2084,7 @@
     </w:p>
     <w:p>
       <w:pPr>
-        <w:pStyle w:val="ListParagraph"/>
+        <w:pStyle w:val="aa"/>
         <w:numPr>
           <w:ilvl w:val="0"/>
           <w:numId w:val="19"/>
@@ -2243,7 +2241,7 @@
     </w:p>
     <w:p>
       <w:pPr>
-        <w:pStyle w:val="ListParagraph"/>
+        <w:pStyle w:val="aa"/>
         <w:numPr>
           <w:ilvl w:val="1"/>
           <w:numId w:val="19"/>
@@ -2316,7 +2314,7 @@
     </w:p>
     <w:p>
       <w:pPr>
-        <w:pStyle w:val="ListParagraph"/>
+        <w:pStyle w:val="aa"/>
         <w:numPr>
           <w:ilvl w:val="1"/>
           <w:numId w:val="19"/>
@@ -2379,7 +2377,7 @@
     </w:p>
     <w:p>
       <w:pPr>
-        <w:pStyle w:val="ListParagraph"/>
+        <w:pStyle w:val="aa"/>
         <w:numPr>
           <w:ilvl w:val="0"/>
           <w:numId w:val="19"/>
@@ -2461,7 +2459,7 @@
     </w:p>
     <w:p>
       <w:pPr>
-        <w:pStyle w:val="ListParagraph"/>
+        <w:pStyle w:val="aa"/>
         <w:numPr>
           <w:ilvl w:val="0"/>
           <w:numId w:val="19"/>
@@ -2520,7 +2518,7 @@
     </w:p>
     <w:p>
       <w:pPr>
-        <w:pStyle w:val="ListParagraph"/>
+        <w:pStyle w:val="aa"/>
         <w:numPr>
           <w:ilvl w:val="0"/>
           <w:numId w:val="19"/>
@@ -2631,7 +2629,7 @@
     </w:p>
     <w:p>
       <w:pPr>
-        <w:pStyle w:val="ListParagraph"/>
+        <w:pStyle w:val="aa"/>
         <w:numPr>
           <w:ilvl w:val="1"/>
           <w:numId w:val="19"/>
@@ -2775,7 +2773,7 @@
     </w:p>
     <w:p>
       <w:pPr>
-        <w:pStyle w:val="ListParagraph"/>
+        <w:pStyle w:val="aa"/>
         <w:numPr>
           <w:ilvl w:val="1"/>
           <w:numId w:val="19"/>
@@ -2978,7 +2976,7 @@
     </w:p>
     <w:p>
       <w:pPr>
-        <w:pStyle w:val="ListParagraph"/>
+        <w:pStyle w:val="aa"/>
         <w:numPr>
           <w:ilvl w:val="2"/>
           <w:numId w:val="19"/>
@@ -3041,7 +3039,7 @@
     </w:p>
     <w:p>
       <w:pPr>
-        <w:pStyle w:val="Heading2"/>
+        <w:pStyle w:val="2"/>
       </w:pPr>
       <w:bookmarkStart w:id="5" w:name="_Toc410819654"/>
       <w:bookmarkStart w:id="6" w:name="_Toc33350368"/>
@@ -3053,7 +3051,7 @@
     </w:p>
     <w:p>
       <w:pPr>
-        <w:pStyle w:val="ListParagraph"/>
+        <w:pStyle w:val="aa"/>
         <w:numPr>
           <w:ilvl w:val="0"/>
           <w:numId w:val="20"/>
@@ -3074,7 +3072,7 @@
     </w:p>
     <w:p>
       <w:pPr>
-        <w:pStyle w:val="ListParagraph"/>
+        <w:pStyle w:val="aa"/>
         <w:numPr>
           <w:ilvl w:val="0"/>
           <w:numId w:val="20"/>
@@ -3089,7 +3087,7 @@
     </w:p>
     <w:p>
       <w:pPr>
-        <w:pStyle w:val="Heading2"/>
+        <w:pStyle w:val="2"/>
       </w:pPr>
       <w:bookmarkStart w:id="7" w:name="_Toc410819655"/>
       <w:bookmarkStart w:id="8" w:name="_Toc33350369"/>
@@ -3101,7 +3099,7 @@
     </w:p>
     <w:p>
       <w:pPr>
-        <w:pStyle w:val="NormalWeb"/>
+        <w:pStyle w:val="ab"/>
         <w:jc w:val="both"/>
       </w:pPr>
       <w:r>
@@ -3116,7 +3114,7 @@
     </w:p>
     <w:p>
       <w:pPr>
-        <w:pStyle w:val="NormalWeb"/>
+        <w:pStyle w:val="ab"/>
         <w:jc w:val="both"/>
       </w:pPr>
       <w:r>
@@ -3125,7 +3123,7 @@
     </w:p>
     <w:p>
       <w:pPr>
-        <w:pStyle w:val="NormalWeb"/>
+        <w:pStyle w:val="ab"/>
         <w:jc w:val="both"/>
       </w:pPr>
       <w:r>
@@ -3188,7 +3186,7 @@
     </w:p>
     <w:p>
       <w:pPr>
-        <w:pStyle w:val="NormalWeb"/>
+        <w:pStyle w:val="ab"/>
         <w:jc w:val="both"/>
       </w:pPr>
       <w:r>
@@ -3225,7 +3223,7 @@
     </w:p>
     <w:p>
       <w:pPr>
-        <w:pStyle w:val="NormalWeb"/>
+        <w:pStyle w:val="ab"/>
         <w:jc w:val="both"/>
       </w:pPr>
       <w:r>
@@ -3237,7 +3235,7 @@
     </w:p>
     <w:p>
       <w:pPr>
-        <w:pStyle w:val="NormalWeb"/>
+        <w:pStyle w:val="ab"/>
         <w:jc w:val="both"/>
       </w:pPr>
       <w:r>
@@ -3252,7 +3250,7 @@
     </w:p>
     <w:p>
       <w:pPr>
-        <w:pStyle w:val="NormalWeb"/>
+        <w:pStyle w:val="ab"/>
         <w:jc w:val="both"/>
       </w:pPr>
       <w:r>
@@ -3276,7 +3274,7 @@
     </w:p>
     <w:p>
       <w:pPr>
-        <w:pStyle w:val="Heading2"/>
+        <w:pStyle w:val="2"/>
       </w:pPr>
       <w:bookmarkStart w:id="9" w:name="_Toc410819656"/>
       <w:bookmarkStart w:id="10" w:name="_Toc33350370"/>
@@ -3371,7 +3369,7 @@
     </w:p>
     <w:p>
       <w:pPr>
-        <w:pStyle w:val="Heading1"/>
+        <w:pStyle w:val="1"/>
       </w:pPr>
       <w:bookmarkStart w:id="11" w:name="_Toc410819657"/>
       <w:bookmarkStart w:id="12" w:name="_Toc33350371"/>
@@ -3467,7 +3465,7 @@
     </w:p>
     <w:p>
       <w:pPr>
-        <w:pStyle w:val="Heading1"/>
+        <w:pStyle w:val="1"/>
       </w:pPr>
       <w:r>
         <w:lastRenderedPageBreak/>
@@ -3631,7 +3629,7 @@
     </w:p>
     <w:p>
       <w:pPr>
-        <w:pStyle w:val="Heading1"/>
+        <w:pStyle w:val="1"/>
       </w:pPr>
       <w:bookmarkStart w:id="14" w:name="_Toc33350373"/>
       <w:r>
@@ -3660,7 +3658,7 @@
     <w:p/>
     <w:tbl>
       <w:tblPr>
-        <w:tblStyle w:val="TableGrid"/>
+        <w:tblStyle w:val="a7"/>
         <w:tblW w:w="11880" w:type="dxa"/>
         <w:tblInd w:w="-1512" w:type="dxa"/>
         <w:tblLook w:val="04A0" w:firstRow="1" w:lastRow="0" w:firstColumn="1" w:lastColumn="0" w:noHBand="0" w:noVBand="1"/>
@@ -3820,7 +3818,6 @@
               </w:rPr>
               <w:t xml:space="preserve">Name </w:t>
             </w:r>
-            <w:proofErr w:type="gramStart"/>
             <w:r>
               <w:rPr>
                 <w:rFonts w:ascii="Consolas" w:hAnsi="Consolas"/>
@@ -3839,7 +3836,6 @@
               </w:rPr>
               <w:t>(</w:t>
             </w:r>
-            <w:proofErr w:type="gramEnd"/>
             <w:r>
               <w:rPr>
                 <w:rFonts w:ascii="Consolas" w:hAnsi="Consolas"/>
@@ -3924,7 +3920,6 @@
               </w:rPr>
               <w:t xml:space="preserve">Email </w:t>
             </w:r>
-            <w:proofErr w:type="gramStart"/>
             <w:r>
               <w:rPr>
                 <w:rFonts w:ascii="Consolas" w:hAnsi="Consolas"/>
@@ -3943,7 +3938,6 @@
               </w:rPr>
               <w:t>(</w:t>
             </w:r>
-            <w:proofErr w:type="gramEnd"/>
             <w:r>
               <w:rPr>
                 <w:rFonts w:ascii="Consolas" w:hAnsi="Consolas"/>
@@ -4046,7 +4040,6 @@
               </w:rPr>
               <w:t xml:space="preserve">Gender </w:t>
             </w:r>
-            <w:proofErr w:type="gramStart"/>
             <w:r>
               <w:rPr>
                 <w:rFonts w:ascii="Consolas" w:hAnsi="Consolas"/>
@@ -4065,7 +4058,6 @@
               </w:rPr>
               <w:t>(</w:t>
             </w:r>
-            <w:proofErr w:type="gramEnd"/>
             <w:r>
               <w:rPr>
                 <w:rFonts w:ascii="Consolas" w:hAnsi="Consolas"/>
@@ -4163,36 +4155,16 @@
                 <w:sz w:val="21"/>
                 <w:szCs w:val="21"/>
               </w:rPr>
-              <w:t xml:space="preserve"> '</w:t>
-            </w:r>
-            <w:proofErr w:type="gramStart"/>
-            <w:r>
-              <w:rPr>
-                <w:rFonts w:ascii="Consolas" w:hAnsi="Consolas"/>
-                <w:color w:val="76923C" w:themeColor="accent3" w:themeShade="BF"/>
-                <w:sz w:val="21"/>
-                <w:szCs w:val="21"/>
-              </w:rPr>
-              <w:t>F'</w:t>
-            </w:r>
-            <w:r>
-              <w:rPr>
-                <w:rFonts w:ascii="Consolas" w:hAnsi="Consolas"/>
-                <w:color w:val="000000" w:themeColor="text1"/>
-                <w:sz w:val="21"/>
-                <w:szCs w:val="21"/>
-              </w:rPr>
-              <w:t>)</w:t>
-            </w:r>
-            <w:proofErr w:type="gramEnd"/>
-            <w:r>
-              <w:rPr>
-                <w:rFonts w:ascii="Consolas" w:hAnsi="Consolas"/>
-                <w:color w:val="000000" w:themeColor="text1"/>
-                <w:sz w:val="21"/>
-                <w:szCs w:val="21"/>
-              </w:rPr>
-              <w:t>),</w:t>
+              <w:t xml:space="preserve"> 'F'</w:t>
+            </w:r>
+            <w:r>
+              <w:rPr>
+                <w:rFonts w:ascii="Consolas" w:hAnsi="Consolas"/>
+                <w:color w:val="000000" w:themeColor="text1"/>
+                <w:sz w:val="21"/>
+                <w:szCs w:val="21"/>
+              </w:rPr>
+              <w:t>)),</w:t>
             </w:r>
           </w:p>
           <w:p>
@@ -4235,7 +4207,6 @@
               </w:rPr>
               <w:t xml:space="preserve"> </w:t>
             </w:r>
-            <w:proofErr w:type="gramStart"/>
             <w:r>
               <w:rPr>
                 <w:rFonts w:ascii="Consolas" w:hAnsi="Consolas"/>
@@ -4254,7 +4225,6 @@
               </w:rPr>
               <w:t>(</w:t>
             </w:r>
-            <w:proofErr w:type="gramEnd"/>
             <w:r>
               <w:rPr>
                 <w:rFonts w:ascii="Consolas" w:hAnsi="Consolas"/>
@@ -4398,7 +4368,6 @@
               </w:rPr>
               <w:t xml:space="preserve">Address </w:t>
             </w:r>
-            <w:proofErr w:type="gramStart"/>
             <w:r>
               <w:rPr>
                 <w:rFonts w:ascii="Consolas" w:hAnsi="Consolas"/>
@@ -4417,7 +4386,6 @@
               </w:rPr>
               <w:t>(</w:t>
             </w:r>
-            <w:proofErr w:type="gramEnd"/>
             <w:r>
               <w:rPr>
                 <w:rFonts w:ascii="Consolas" w:hAnsi="Consolas"/>
@@ -4955,7 +4923,6 @@
               </w:rPr>
               <w:t xml:space="preserve">Name </w:t>
             </w:r>
-            <w:proofErr w:type="gramStart"/>
             <w:r>
               <w:rPr>
                 <w:rFonts w:ascii="Consolas" w:hAnsi="Consolas"/>
@@ -4974,7 +4941,6 @@
               </w:rPr>
               <w:t>(</w:t>
             </w:r>
-            <w:proofErr w:type="gramEnd"/>
             <w:r>
               <w:rPr>
                 <w:rFonts w:ascii="Consolas" w:hAnsi="Consolas"/>
@@ -5059,7 +5025,6 @@
               </w:rPr>
               <w:t xml:space="preserve">Email </w:t>
             </w:r>
-            <w:proofErr w:type="gramStart"/>
             <w:r>
               <w:rPr>
                 <w:rFonts w:ascii="Consolas" w:hAnsi="Consolas"/>
@@ -5078,7 +5043,6 @@
               </w:rPr>
               <w:t>(</w:t>
             </w:r>
-            <w:proofErr w:type="gramEnd"/>
             <w:r>
               <w:rPr>
                 <w:rFonts w:ascii="Consolas" w:hAnsi="Consolas"/>
@@ -5181,7 +5145,6 @@
               </w:rPr>
               <w:t xml:space="preserve">Gender </w:t>
             </w:r>
-            <w:proofErr w:type="gramStart"/>
             <w:r>
               <w:rPr>
                 <w:rFonts w:ascii="Consolas" w:hAnsi="Consolas"/>
@@ -5200,7 +5163,6 @@
               </w:rPr>
               <w:t>(</w:t>
             </w:r>
-            <w:proofErr w:type="gramEnd"/>
             <w:r>
               <w:rPr>
                 <w:rFonts w:ascii="Consolas" w:hAnsi="Consolas"/>
@@ -5298,36 +5260,16 @@
                 <w:sz w:val="21"/>
                 <w:szCs w:val="21"/>
               </w:rPr>
-              <w:t xml:space="preserve"> '</w:t>
-            </w:r>
-            <w:proofErr w:type="gramStart"/>
-            <w:r>
-              <w:rPr>
-                <w:rFonts w:ascii="Consolas" w:hAnsi="Consolas"/>
-                <w:color w:val="76923C" w:themeColor="accent3" w:themeShade="BF"/>
-                <w:sz w:val="21"/>
-                <w:szCs w:val="21"/>
-              </w:rPr>
-              <w:t>F'</w:t>
-            </w:r>
-            <w:r>
-              <w:rPr>
-                <w:rFonts w:ascii="Consolas" w:hAnsi="Consolas"/>
-                <w:color w:val="000000" w:themeColor="text1"/>
-                <w:sz w:val="21"/>
-                <w:szCs w:val="21"/>
-              </w:rPr>
-              <w:t>)</w:t>
-            </w:r>
-            <w:proofErr w:type="gramEnd"/>
-            <w:r>
-              <w:rPr>
-                <w:rFonts w:ascii="Consolas" w:hAnsi="Consolas"/>
-                <w:color w:val="000000" w:themeColor="text1"/>
-                <w:sz w:val="21"/>
-                <w:szCs w:val="21"/>
-              </w:rPr>
-              <w:t>),</w:t>
+              <w:t xml:space="preserve"> 'F'</w:t>
+            </w:r>
+            <w:r>
+              <w:rPr>
+                <w:rFonts w:ascii="Consolas" w:hAnsi="Consolas"/>
+                <w:color w:val="000000" w:themeColor="text1"/>
+                <w:sz w:val="21"/>
+                <w:szCs w:val="21"/>
+              </w:rPr>
+              <w:t>)),</w:t>
             </w:r>
           </w:p>
           <w:p>
@@ -5370,7 +5312,6 @@
               </w:rPr>
               <w:t xml:space="preserve"> </w:t>
             </w:r>
-            <w:proofErr w:type="gramStart"/>
             <w:r>
               <w:rPr>
                 <w:rFonts w:ascii="Consolas" w:hAnsi="Consolas"/>
@@ -5389,7 +5330,6 @@
               </w:rPr>
               <w:t>(</w:t>
             </w:r>
-            <w:proofErr w:type="gramEnd"/>
             <w:r>
               <w:rPr>
                 <w:rFonts w:ascii="Consolas" w:hAnsi="Consolas"/>
@@ -5542,7 +5482,6 @@
               </w:rPr>
               <w:t xml:space="preserve">Salary </w:t>
             </w:r>
-            <w:proofErr w:type="gramStart"/>
             <w:r>
               <w:rPr>
                 <w:rFonts w:ascii="Consolas" w:hAnsi="Consolas"/>
@@ -5561,7 +5500,6 @@
               </w:rPr>
               <w:t>(</w:t>
             </w:r>
-            <w:proofErr w:type="gramEnd"/>
             <w:r>
               <w:rPr>
                 <w:rFonts w:ascii="Consolas" w:hAnsi="Consolas"/>
@@ -5820,7 +5758,6 @@
               </w:rPr>
               <w:t xml:space="preserve"> </w:t>
             </w:r>
-            <w:proofErr w:type="gramStart"/>
             <w:r>
               <w:rPr>
                 <w:rFonts w:ascii="Consolas" w:hAnsi="Consolas"/>
@@ -5839,7 +5776,6 @@
               </w:rPr>
               <w:t>(</w:t>
             </w:r>
-            <w:proofErr w:type="gramEnd"/>
             <w:r>
               <w:rPr>
                 <w:rFonts w:ascii="Consolas" w:hAnsi="Consolas"/>
@@ -6001,7 +5937,6 @@
               </w:rPr>
               <w:t xml:space="preserve">REFERENCES </w:t>
             </w:r>
-            <w:proofErr w:type="gramStart"/>
             <w:r>
               <w:rPr>
                 <w:rFonts w:ascii="Consolas" w:hAnsi="Consolas"/>
@@ -6012,7 +5947,6 @@
               <w:t>Department(</w:t>
             </w:r>
             <w:proofErr w:type="spellStart"/>
-            <w:proofErr w:type="gramEnd"/>
             <w:r>
               <w:rPr>
                 <w:rFonts w:ascii="Consolas" w:hAnsi="Consolas"/>
@@ -6223,7 +6157,6 @@
               </w:rPr>
               <w:t xml:space="preserve">REFERENCES </w:t>
             </w:r>
-            <w:proofErr w:type="gramStart"/>
             <w:r>
               <w:rPr>
                 <w:rFonts w:ascii="Consolas" w:hAnsi="Consolas"/>
@@ -6235,7 +6168,6 @@
               <w:t>Employees(</w:t>
             </w:r>
             <w:proofErr w:type="spellStart"/>
-            <w:proofErr w:type="gramEnd"/>
             <w:r>
               <w:rPr>
                 <w:rFonts w:ascii="Consolas" w:hAnsi="Consolas"/>
@@ -6362,7 +6294,6 @@
               </w:rPr>
               <w:t xml:space="preserve"> </w:t>
             </w:r>
-            <w:proofErr w:type="gramStart"/>
             <w:r>
               <w:rPr>
                 <w:rFonts w:ascii="Consolas" w:hAnsi="Consolas"/>
@@ -6381,7 +6312,6 @@
               </w:rPr>
               <w:t>(</w:t>
             </w:r>
-            <w:proofErr w:type="gramEnd"/>
             <w:r>
               <w:rPr>
                 <w:rFonts w:ascii="Consolas" w:hAnsi="Consolas"/>
@@ -6516,7 +6446,6 @@
               </w:rPr>
               <w:t xml:space="preserve">Gender </w:t>
             </w:r>
-            <w:proofErr w:type="gramStart"/>
             <w:r>
               <w:rPr>
                 <w:rFonts w:ascii="Consolas" w:hAnsi="Consolas"/>
@@ -6535,7 +6464,6 @@
               </w:rPr>
               <w:t>(</w:t>
             </w:r>
-            <w:proofErr w:type="gramEnd"/>
             <w:r>
               <w:rPr>
                 <w:rFonts w:ascii="Consolas" w:hAnsi="Consolas"/>
@@ -6633,36 +6561,16 @@
                 <w:sz w:val="21"/>
                 <w:szCs w:val="21"/>
               </w:rPr>
-              <w:t xml:space="preserve"> '</w:t>
-            </w:r>
-            <w:proofErr w:type="gramStart"/>
-            <w:r>
-              <w:rPr>
-                <w:rFonts w:ascii="Consolas" w:hAnsi="Consolas"/>
-                <w:color w:val="76923C" w:themeColor="accent3" w:themeShade="BF"/>
-                <w:sz w:val="21"/>
-                <w:szCs w:val="21"/>
-              </w:rPr>
-              <w:t>F'</w:t>
-            </w:r>
-            <w:r>
-              <w:rPr>
-                <w:rFonts w:ascii="Consolas" w:hAnsi="Consolas"/>
-                <w:color w:val="000000" w:themeColor="text1"/>
-                <w:sz w:val="21"/>
-                <w:szCs w:val="21"/>
-              </w:rPr>
-              <w:t>)</w:t>
-            </w:r>
-            <w:proofErr w:type="gramEnd"/>
-            <w:r>
-              <w:rPr>
-                <w:rFonts w:ascii="Consolas" w:hAnsi="Consolas"/>
-                <w:color w:val="000000" w:themeColor="text1"/>
-                <w:sz w:val="21"/>
-                <w:szCs w:val="21"/>
-              </w:rPr>
-              <w:t>),</w:t>
+              <w:t xml:space="preserve"> 'F'</w:t>
+            </w:r>
+            <w:r>
+              <w:rPr>
+                <w:rFonts w:ascii="Consolas" w:hAnsi="Consolas"/>
+                <w:color w:val="000000" w:themeColor="text1"/>
+                <w:sz w:val="21"/>
+                <w:szCs w:val="21"/>
+              </w:rPr>
+              <w:t>)),</w:t>
             </w:r>
           </w:p>
           <w:p>
@@ -6694,7 +6602,6 @@
               </w:rPr>
               <w:t xml:space="preserve">Relationship </w:t>
             </w:r>
-            <w:proofErr w:type="gramStart"/>
             <w:r>
               <w:rPr>
                 <w:rFonts w:ascii="Consolas" w:hAnsi="Consolas"/>
@@ -6713,7 +6620,6 @@
               </w:rPr>
               <w:t>(</w:t>
             </w:r>
-            <w:proofErr w:type="gramEnd"/>
             <w:r>
               <w:rPr>
                 <w:rFonts w:ascii="Consolas" w:hAnsi="Consolas"/>
@@ -6948,7 +6854,6 @@
               </w:rPr>
               <w:t xml:space="preserve">REFERENCES </w:t>
             </w:r>
-            <w:proofErr w:type="gramStart"/>
             <w:r>
               <w:rPr>
                 <w:rFonts w:ascii="Consolas" w:hAnsi="Consolas"/>
@@ -6959,7 +6864,6 @@
               <w:t>Employees(</w:t>
             </w:r>
             <w:proofErr w:type="spellStart"/>
-            <w:proofErr w:type="gramEnd"/>
             <w:r>
               <w:rPr>
                 <w:rFonts w:ascii="Consolas" w:hAnsi="Consolas"/>
@@ -7173,7 +7077,6 @@
               </w:rPr>
               <w:t xml:space="preserve"> </w:t>
             </w:r>
-            <w:proofErr w:type="gramStart"/>
             <w:r>
               <w:rPr>
                 <w:rFonts w:ascii="Consolas" w:hAnsi="Consolas"/>
@@ -7192,7 +7095,6 @@
               </w:rPr>
               <w:t>(</w:t>
             </w:r>
-            <w:proofErr w:type="gramEnd"/>
             <w:r>
               <w:rPr>
                 <w:rFonts w:ascii="Consolas" w:hAnsi="Consolas"/>
@@ -7277,7 +7179,6 @@
               </w:rPr>
               <w:t xml:space="preserve">Price </w:t>
             </w:r>
-            <w:proofErr w:type="gramStart"/>
             <w:r>
               <w:rPr>
                 <w:rFonts w:ascii="Consolas" w:hAnsi="Consolas"/>
@@ -7296,7 +7197,6 @@
               </w:rPr>
               <w:t>(</w:t>
             </w:r>
-            <w:proofErr w:type="gramEnd"/>
             <w:r>
               <w:rPr>
                 <w:rFonts w:ascii="Consolas" w:hAnsi="Consolas"/>
@@ -7631,7 +7531,6 @@
               </w:rPr>
               <w:t xml:space="preserve"> </w:t>
             </w:r>
-            <w:proofErr w:type="gramStart"/>
             <w:r>
               <w:rPr>
                 <w:rFonts w:ascii="Consolas" w:hAnsi="Consolas"/>
@@ -7650,7 +7549,6 @@
               </w:rPr>
               <w:t>(</w:t>
             </w:r>
-            <w:proofErr w:type="gramEnd"/>
             <w:r>
               <w:rPr>
                 <w:rFonts w:ascii="Consolas" w:hAnsi="Consolas"/>
@@ -7744,7 +7642,6 @@
               </w:rPr>
               <w:t xml:space="preserve"> </w:t>
             </w:r>
-            <w:proofErr w:type="gramStart"/>
             <w:r>
               <w:rPr>
                 <w:rFonts w:ascii="Consolas" w:hAnsi="Consolas"/>
@@ -7763,7 +7660,6 @@
               </w:rPr>
               <w:t>(</w:t>
             </w:r>
-            <w:proofErr w:type="gramEnd"/>
             <w:r>
               <w:rPr>
                 <w:rFonts w:ascii="Consolas" w:hAnsi="Consolas"/>
@@ -8025,7 +7921,6 @@
               </w:rPr>
               <w:t xml:space="preserve"> </w:t>
             </w:r>
-            <w:proofErr w:type="gramStart"/>
             <w:r>
               <w:rPr>
                 <w:rFonts w:ascii="Consolas" w:hAnsi="Consolas"/>
@@ -8044,7 +7939,6 @@
               </w:rPr>
               <w:t>(</w:t>
             </w:r>
-            <w:proofErr w:type="gramEnd"/>
             <w:r>
               <w:rPr>
                 <w:rFonts w:ascii="Consolas" w:hAnsi="Consolas"/>
@@ -8414,7 +8308,6 @@
               </w:rPr>
               <w:t xml:space="preserve"> </w:t>
             </w:r>
-            <w:proofErr w:type="gramStart"/>
             <w:r>
               <w:rPr>
                 <w:rFonts w:ascii="Consolas" w:hAnsi="Consolas"/>
@@ -8433,7 +8326,6 @@
               </w:rPr>
               <w:t>(</w:t>
             </w:r>
-            <w:proofErr w:type="gramEnd"/>
             <w:r>
               <w:rPr>
                 <w:rFonts w:ascii="Consolas" w:hAnsi="Consolas"/>
@@ -8693,25 +8585,14 @@
               </w:rPr>
               <w:t xml:space="preserve">REFERENCES </w:t>
             </w:r>
-            <w:proofErr w:type="gramStart"/>
-            <w:r>
-              <w:rPr>
-                <w:rFonts w:ascii="Consolas" w:hAnsi="Consolas"/>
-                <w:color w:val="000000" w:themeColor="text1"/>
-                <w:sz w:val="21"/>
-                <w:szCs w:val="21"/>
-              </w:rPr>
-              <w:t>Customer(</w:t>
-            </w:r>
-            <w:proofErr w:type="gramEnd"/>
-            <w:r>
-              <w:rPr>
-                <w:rFonts w:ascii="Consolas" w:hAnsi="Consolas"/>
-                <w:color w:val="000000" w:themeColor="text1"/>
-                <w:sz w:val="21"/>
-                <w:szCs w:val="21"/>
-              </w:rPr>
-              <w:t xml:space="preserve">ID) </w:t>
+            <w:r>
+              <w:rPr>
+                <w:rFonts w:ascii="Consolas" w:hAnsi="Consolas"/>
+                <w:color w:val="000000" w:themeColor="text1"/>
+                <w:sz w:val="21"/>
+                <w:szCs w:val="21"/>
+              </w:rPr>
+              <w:t xml:space="preserve">Customer(ID) </w:t>
             </w:r>
           </w:p>
           <w:p>
@@ -9221,7 +9102,6 @@
               </w:rPr>
               <w:t xml:space="preserve">REFERENCES </w:t>
             </w:r>
-            <w:proofErr w:type="gramStart"/>
             <w:r>
               <w:rPr>
                 <w:rFonts w:ascii="Consolas" w:hAnsi="Consolas"/>
@@ -9232,7 +9112,6 @@
               <w:t>Books(</w:t>
             </w:r>
             <w:proofErr w:type="spellStart"/>
-            <w:proofErr w:type="gramEnd"/>
             <w:r>
               <w:rPr>
                 <w:rFonts w:ascii="Consolas" w:hAnsi="Consolas"/>
@@ -9329,7 +9208,6 @@
               </w:rPr>
               <w:t xml:space="preserve">REFERENCES </w:t>
             </w:r>
-            <w:proofErr w:type="gramStart"/>
             <w:r>
               <w:rPr>
                 <w:rFonts w:ascii="Consolas" w:hAnsi="Consolas"/>
@@ -9340,7 +9218,6 @@
               <w:t>Orders(</w:t>
             </w:r>
             <w:proofErr w:type="spellStart"/>
-            <w:proofErr w:type="gramEnd"/>
             <w:r>
               <w:rPr>
                 <w:rFonts w:ascii="Consolas" w:hAnsi="Consolas"/>
@@ -9844,7 +9721,6 @@
               </w:rPr>
               <w:t xml:space="preserve">REFERENCES </w:t>
             </w:r>
-            <w:proofErr w:type="gramStart"/>
             <w:r>
               <w:rPr>
                 <w:rFonts w:ascii="Consolas" w:hAnsi="Consolas"/>
@@ -9855,7 +9731,6 @@
               <w:t>Orders(</w:t>
             </w:r>
             <w:proofErr w:type="spellStart"/>
-            <w:proofErr w:type="gramEnd"/>
             <w:r>
               <w:rPr>
                 <w:rFonts w:ascii="Consolas" w:hAnsi="Consolas"/>
@@ -9943,7 +9818,6 @@
               </w:rPr>
               <w:t xml:space="preserve">REFERENCES </w:t>
             </w:r>
-            <w:proofErr w:type="gramStart"/>
             <w:r>
               <w:rPr>
                 <w:rFonts w:ascii="Consolas" w:hAnsi="Consolas"/>
@@ -9954,7 +9828,6 @@
               <w:t>Books(</w:t>
             </w:r>
             <w:proofErr w:type="spellStart"/>
-            <w:proofErr w:type="gramEnd"/>
             <w:r>
               <w:rPr>
                 <w:rFonts w:ascii="Consolas" w:hAnsi="Consolas"/>
@@ -10394,7 +10267,6 @@
               </w:rPr>
               <w:t xml:space="preserve">REFERENCES </w:t>
             </w:r>
-            <w:proofErr w:type="gramStart"/>
             <w:r>
               <w:rPr>
                 <w:rFonts w:ascii="Consolas" w:hAnsi="Consolas"/>
@@ -10405,7 +10277,6 @@
               <w:t>Books(</w:t>
             </w:r>
             <w:proofErr w:type="spellStart"/>
-            <w:proofErr w:type="gramEnd"/>
             <w:r>
               <w:rPr>
                 <w:rFonts w:ascii="Consolas" w:hAnsi="Consolas"/>
@@ -10502,7 +10373,6 @@
               </w:rPr>
               <w:t xml:space="preserve">REFERENCES </w:t>
             </w:r>
-            <w:proofErr w:type="gramStart"/>
             <w:r>
               <w:rPr>
                 <w:rFonts w:ascii="Consolas" w:hAnsi="Consolas"/>
@@ -10513,7 +10383,6 @@
               <w:t>Authors(</w:t>
             </w:r>
             <w:proofErr w:type="spellStart"/>
-            <w:proofErr w:type="gramEnd"/>
             <w:r>
               <w:rPr>
                 <w:rFonts w:ascii="Consolas" w:hAnsi="Consolas"/>
@@ -10943,7 +10812,6 @@
               </w:rPr>
               <w:t xml:space="preserve">REFERENCES </w:t>
             </w:r>
-            <w:proofErr w:type="gramStart"/>
             <w:r>
               <w:rPr>
                 <w:rFonts w:ascii="Consolas" w:hAnsi="Consolas"/>
@@ -10954,7 +10822,6 @@
               <w:t>Books(</w:t>
             </w:r>
             <w:proofErr w:type="spellStart"/>
-            <w:proofErr w:type="gramEnd"/>
             <w:r>
               <w:rPr>
                 <w:rFonts w:ascii="Consolas" w:hAnsi="Consolas"/>
@@ -11042,7 +10909,6 @@
               </w:rPr>
               <w:t xml:space="preserve">REFERENCES </w:t>
             </w:r>
-            <w:proofErr w:type="gramStart"/>
             <w:r>
               <w:rPr>
                 <w:rFonts w:ascii="Consolas" w:hAnsi="Consolas"/>
@@ -11053,7 +10919,6 @@
               <w:t>Categories(</w:t>
             </w:r>
             <w:proofErr w:type="spellStart"/>
-            <w:proofErr w:type="gramEnd"/>
             <w:r>
               <w:rPr>
                 <w:rFonts w:ascii="Consolas" w:hAnsi="Consolas"/>
@@ -11430,7 +11295,6 @@
               </w:rPr>
               <w:t xml:space="preserve">REFERENCES </w:t>
             </w:r>
-            <w:proofErr w:type="gramStart"/>
             <w:r>
               <w:rPr>
                 <w:rFonts w:ascii="Consolas" w:hAnsi="Consolas"/>
@@ -11441,7 +11305,6 @@
               <w:t>Employees(</w:t>
             </w:r>
             <w:proofErr w:type="spellStart"/>
-            <w:proofErr w:type="gramEnd"/>
             <w:r>
               <w:rPr>
                 <w:rFonts w:ascii="Consolas" w:hAnsi="Consolas"/>
@@ -11500,7 +11363,6 @@
               </w:rPr>
               <w:t xml:space="preserve">REFERENCES </w:t>
             </w:r>
-            <w:proofErr w:type="gramStart"/>
             <w:r>
               <w:rPr>
                 <w:rFonts w:ascii="Consolas" w:hAnsi="Consolas"/>
@@ -11511,7 +11373,6 @@
               <w:t>Books(</w:t>
             </w:r>
             <w:proofErr w:type="spellStart"/>
-            <w:proofErr w:type="gramEnd"/>
             <w:r>
               <w:rPr>
                 <w:rFonts w:ascii="Consolas" w:hAnsi="Consolas"/>
@@ -11565,7 +11426,7 @@
               <w:shd w:val="clear" w:color="auto" w:fill="FFFFFF"/>
               <w:spacing w:line="285" w:lineRule="atLeast"/>
               <w:rPr>
-                <w:rFonts w:ascii="Consolas" w:hAnsi="Consolas" w:hint="cs"/>
+                <w:rFonts w:ascii="Consolas" w:hAnsi="Consolas"/>
                 <w:color w:val="000000"/>
                 <w:sz w:val="21"/>
                 <w:szCs w:val="21"/>
@@ -11690,7 +11551,16 @@
                 <w:sz w:val="21"/>
                 <w:szCs w:val="21"/>
               </w:rPr>
-              <w:t>INT,</w:t>
+              <w:t>INT</w:t>
+            </w:r>
+            <w:r>
+              <w:rPr>
+                <w:rFonts w:ascii="Consolas" w:hAnsi="Consolas"/>
+                <w:color w:val="000000" w:themeColor="text1"/>
+                <w:sz w:val="21"/>
+                <w:szCs w:val="21"/>
+              </w:rPr>
+              <w:t>,</w:t>
             </w:r>
           </w:p>
           <w:p>
@@ -11699,7 +11569,7 @@
               <w:spacing w:line="285" w:lineRule="atLeast"/>
               <w:rPr>
                 <w:rFonts w:ascii="Consolas" w:hAnsi="Consolas"/>
-                <w:color w:val="0000FF"/>
+                <w:color w:val="000000" w:themeColor="text1"/>
                 <w:sz w:val="21"/>
                 <w:szCs w:val="21"/>
               </w:rPr>
@@ -11740,7 +11610,16 @@
                 <w:sz w:val="21"/>
                 <w:szCs w:val="21"/>
               </w:rPr>
-              <w:t>INT,</w:t>
+              <w:t>INT</w:t>
+            </w:r>
+            <w:r>
+              <w:rPr>
+                <w:rFonts w:ascii="Consolas" w:hAnsi="Consolas"/>
+                <w:color w:val="000000" w:themeColor="text1"/>
+                <w:sz w:val="21"/>
+                <w:szCs w:val="21"/>
+              </w:rPr>
+              <w:t>,</w:t>
             </w:r>
           </w:p>
           <w:p>
@@ -11754,55 +11633,6 @@
                 <w:szCs w:val="21"/>
               </w:rPr>
             </w:pPr>
-            <w:r>
-              <w:rPr>
-                <w:rFonts w:ascii="Consolas" w:hAnsi="Consolas"/>
-                <w:color w:val="0000FF"/>
-                <w:sz w:val="21"/>
-                <w:szCs w:val="21"/>
-              </w:rPr>
-              <w:t xml:space="preserve">    PRIMARY KEY (</w:t>
-            </w:r>
-            <w:proofErr w:type="spellStart"/>
-            <w:r>
-              <w:rPr>
-                <w:rFonts w:ascii="Consolas" w:hAnsi="Consolas"/>
-                <w:color w:val="000000" w:themeColor="text1"/>
-                <w:sz w:val="21"/>
-                <w:szCs w:val="21"/>
-              </w:rPr>
-              <w:t>Customer_ID</w:t>
-            </w:r>
-            <w:proofErr w:type="spellEnd"/>
-            <w:r>
-              <w:rPr>
-                <w:rFonts w:ascii="Consolas" w:hAnsi="Consolas"/>
-                <w:color w:val="000000" w:themeColor="text1"/>
-                <w:sz w:val="21"/>
-                <w:szCs w:val="21"/>
-              </w:rPr>
-              <w:t xml:space="preserve">, </w:t>
-            </w:r>
-            <w:proofErr w:type="spellStart"/>
-            <w:r>
-              <w:rPr>
-                <w:rFonts w:ascii="Consolas" w:hAnsi="Consolas"/>
-                <w:color w:val="000000" w:themeColor="text1"/>
-                <w:sz w:val="21"/>
-                <w:szCs w:val="21"/>
-              </w:rPr>
-              <w:t>Employee_ID</w:t>
-            </w:r>
-            <w:proofErr w:type="spellEnd"/>
-            <w:r>
-              <w:rPr>
-                <w:rFonts w:ascii="Consolas" w:hAnsi="Consolas"/>
-                <w:color w:val="0000FF"/>
-                <w:sz w:val="21"/>
-                <w:szCs w:val="21"/>
-              </w:rPr>
-              <w:t>),</w:t>
-            </w:r>
           </w:p>
           <w:p>
             <w:pPr>
@@ -11810,19 +11640,28 @@
               <w:spacing w:line="285" w:lineRule="atLeast"/>
               <w:rPr>
                 <w:rFonts w:ascii="Consolas" w:hAnsi="Consolas"/>
-                <w:color w:val="0000FF"/>
-                <w:sz w:val="21"/>
-                <w:szCs w:val="21"/>
-              </w:rPr>
-            </w:pPr>
-            <w:r>
-              <w:rPr>
-                <w:rFonts w:ascii="Consolas" w:hAnsi="Consolas"/>
-                <w:color w:val="0000FF"/>
-                <w:sz w:val="21"/>
-                <w:szCs w:val="21"/>
-              </w:rPr>
-              <w:t xml:space="preserve">    FOREIGN KEY (</w:t>
+                <w:color w:val="000000" w:themeColor="text1"/>
+                <w:sz w:val="21"/>
+                <w:szCs w:val="21"/>
+              </w:rPr>
+            </w:pPr>
+            <w:r>
+              <w:rPr>
+                <w:rFonts w:ascii="Consolas" w:hAnsi="Consolas"/>
+                <w:color w:val="0000FF"/>
+                <w:sz w:val="21"/>
+                <w:szCs w:val="21"/>
+              </w:rPr>
+              <w:t xml:space="preserve">    PRIMARY KEY </w:t>
+            </w:r>
+            <w:r>
+              <w:rPr>
+                <w:rFonts w:ascii="Consolas" w:hAnsi="Consolas"/>
+                <w:color w:val="000000" w:themeColor="text1"/>
+                <w:sz w:val="21"/>
+                <w:szCs w:val="21"/>
+              </w:rPr>
+              <w:t>(</w:t>
             </w:r>
             <w:proofErr w:type="spellStart"/>
             <w:r>
@@ -11838,31 +11677,31 @@
             <w:r>
               <w:rPr>
                 <w:rFonts w:ascii="Consolas" w:hAnsi="Consolas"/>
-                <w:color w:val="0000FF"/>
-                <w:sz w:val="21"/>
-                <w:szCs w:val="21"/>
-              </w:rPr>
-              <w:t xml:space="preserve">) REFERENCES </w:t>
-            </w:r>
-            <w:proofErr w:type="gramStart"/>
-            <w:r>
-              <w:rPr>
-                <w:rFonts w:ascii="Consolas" w:hAnsi="Consolas"/>
-                <w:color w:val="000000" w:themeColor="text1"/>
-                <w:sz w:val="21"/>
-                <w:szCs w:val="21"/>
-              </w:rPr>
-              <w:t>Customer(</w:t>
-            </w:r>
-            <w:proofErr w:type="gramEnd"/>
-            <w:r>
-              <w:rPr>
-                <w:rFonts w:ascii="Consolas" w:hAnsi="Consolas"/>
-                <w:color w:val="000000" w:themeColor="text1"/>
-                <w:sz w:val="21"/>
-                <w:szCs w:val="21"/>
-              </w:rPr>
-              <w:t>ID),</w:t>
+                <w:color w:val="000000" w:themeColor="text1"/>
+                <w:sz w:val="21"/>
+                <w:szCs w:val="21"/>
+              </w:rPr>
+              <w:t xml:space="preserve">, </w:t>
+            </w:r>
+            <w:proofErr w:type="spellStart"/>
+            <w:r>
+              <w:rPr>
+                <w:rFonts w:ascii="Consolas" w:hAnsi="Consolas"/>
+                <w:color w:val="000000" w:themeColor="text1"/>
+                <w:sz w:val="21"/>
+                <w:szCs w:val="21"/>
+              </w:rPr>
+              <w:t>Employee_ID</w:t>
+            </w:r>
+            <w:proofErr w:type="spellEnd"/>
+            <w:r>
+              <w:rPr>
+                <w:rFonts w:ascii="Consolas" w:hAnsi="Consolas"/>
+                <w:color w:val="000000" w:themeColor="text1"/>
+                <w:sz w:val="21"/>
+                <w:szCs w:val="21"/>
+              </w:rPr>
+              <w:t>),</w:t>
             </w:r>
           </w:p>
           <w:p>
@@ -11871,19 +11710,40 @@
               <w:spacing w:line="285" w:lineRule="atLeast"/>
               <w:rPr>
                 <w:rFonts w:ascii="Consolas" w:hAnsi="Consolas"/>
-                <w:color w:val="0000FF"/>
-                <w:sz w:val="21"/>
-                <w:szCs w:val="21"/>
-              </w:rPr>
-            </w:pPr>
-            <w:r>
-              <w:rPr>
-                <w:rFonts w:ascii="Consolas" w:hAnsi="Consolas"/>
-                <w:color w:val="0000FF"/>
-                <w:sz w:val="21"/>
-                <w:szCs w:val="21"/>
-              </w:rPr>
-              <w:t xml:space="preserve">    FOREIGN KEY (</w:t>
+                <w:color w:val="000000" w:themeColor="text1"/>
+                <w:sz w:val="21"/>
+                <w:szCs w:val="21"/>
+              </w:rPr>
+            </w:pPr>
+          </w:p>
+          <w:p>
+            <w:pPr>
+              <w:shd w:val="clear" w:color="auto" w:fill="FFFFFF"/>
+              <w:spacing w:line="285" w:lineRule="atLeast"/>
+              <w:rPr>
+                <w:rFonts w:ascii="Consolas" w:hAnsi="Consolas"/>
+                <w:color w:val="0000FF"/>
+                <w:sz w:val="21"/>
+                <w:szCs w:val="21"/>
+              </w:rPr>
+            </w:pPr>
+            <w:r>
+              <w:rPr>
+                <w:rFonts w:ascii="Consolas" w:hAnsi="Consolas"/>
+                <w:color w:val="0000FF"/>
+                <w:sz w:val="21"/>
+                <w:szCs w:val="21"/>
+              </w:rPr>
+              <w:t xml:space="preserve">    FOREIGN KEY </w:t>
+            </w:r>
+            <w:r>
+              <w:rPr>
+                <w:rFonts w:ascii="Consolas" w:hAnsi="Consolas"/>
+                <w:color w:val="000000" w:themeColor="text1"/>
+                <w:sz w:val="21"/>
+                <w:szCs w:val="21"/>
+              </w:rPr>
+              <w:t>(</w:t>
             </w:r>
             <w:proofErr w:type="spellStart"/>
             <w:r>
@@ -11893,19 +11753,95 @@
                 <w:sz w:val="21"/>
                 <w:szCs w:val="21"/>
               </w:rPr>
+              <w:t>Customer_ID</w:t>
+            </w:r>
+            <w:proofErr w:type="spellEnd"/>
+            <w:r>
+              <w:rPr>
+                <w:rFonts w:ascii="Consolas" w:hAnsi="Consolas"/>
+                <w:color w:val="000000" w:themeColor="text1"/>
+                <w:sz w:val="21"/>
+                <w:szCs w:val="21"/>
+              </w:rPr>
+              <w:t>)</w:t>
+            </w:r>
+            <w:r>
+              <w:rPr>
+                <w:rFonts w:ascii="Consolas" w:hAnsi="Consolas"/>
+                <w:color w:val="0000FF"/>
+                <w:sz w:val="21"/>
+                <w:szCs w:val="21"/>
+              </w:rPr>
+              <w:t xml:space="preserve"> REFERENCES </w:t>
+            </w:r>
+            <w:r>
+              <w:rPr>
+                <w:rFonts w:ascii="Consolas" w:hAnsi="Consolas"/>
+                <w:color w:val="000000" w:themeColor="text1"/>
+                <w:sz w:val="21"/>
+                <w:szCs w:val="21"/>
+              </w:rPr>
+              <w:t>Customer(ID),</w:t>
+            </w:r>
+          </w:p>
+          <w:p>
+            <w:pPr>
+              <w:shd w:val="clear" w:color="auto" w:fill="FFFFFF"/>
+              <w:spacing w:line="285" w:lineRule="atLeast"/>
+              <w:rPr>
+                <w:rFonts w:ascii="Consolas" w:hAnsi="Consolas"/>
+                <w:color w:val="0000FF"/>
+                <w:sz w:val="21"/>
+                <w:szCs w:val="21"/>
+              </w:rPr>
+            </w:pPr>
+            <w:r>
+              <w:rPr>
+                <w:rFonts w:ascii="Consolas" w:hAnsi="Consolas"/>
+                <w:color w:val="0000FF"/>
+                <w:sz w:val="21"/>
+                <w:szCs w:val="21"/>
+              </w:rPr>
+              <w:t xml:space="preserve">    FOREIGN KEY </w:t>
+            </w:r>
+            <w:r>
+              <w:rPr>
+                <w:rFonts w:ascii="Consolas" w:hAnsi="Consolas"/>
+                <w:color w:val="000000" w:themeColor="text1"/>
+                <w:sz w:val="21"/>
+                <w:szCs w:val="21"/>
+              </w:rPr>
+              <w:t>(</w:t>
+            </w:r>
+            <w:proofErr w:type="spellStart"/>
+            <w:r>
+              <w:rPr>
+                <w:rFonts w:ascii="Consolas" w:hAnsi="Consolas"/>
+                <w:color w:val="000000" w:themeColor="text1"/>
+                <w:sz w:val="21"/>
+                <w:szCs w:val="21"/>
+              </w:rPr>
               <w:t>Employee_ID</w:t>
             </w:r>
             <w:proofErr w:type="spellEnd"/>
             <w:r>
               <w:rPr>
                 <w:rFonts w:ascii="Consolas" w:hAnsi="Consolas"/>
-                <w:color w:val="0000FF"/>
-                <w:sz w:val="21"/>
-                <w:szCs w:val="21"/>
-              </w:rPr>
-              <w:t xml:space="preserve">) REFERENCES </w:t>
-            </w:r>
-            <w:proofErr w:type="gramStart"/>
+                <w:color w:val="000000" w:themeColor="text1"/>
+                <w:sz w:val="21"/>
+                <w:szCs w:val="21"/>
+              </w:rPr>
+              <w:t>)</w:t>
+            </w:r>
+            <w:r>
+              <w:rPr>
+                <w:rFonts w:ascii="Consolas" w:hAnsi="Consolas"/>
+                <w:color w:val="0000FF"/>
+                <w:sz w:val="21"/>
+                <w:szCs w:val="21"/>
+              </w:rPr>
+              <w:t xml:space="preserve"> REFERENCES </w:t>
+            </w:r>
             <w:r>
               <w:rPr>
                 <w:rFonts w:ascii="Consolas" w:hAnsi="Consolas"/>
@@ -11916,7 +11852,6 @@
               <w:t>Employees(</w:t>
             </w:r>
             <w:proofErr w:type="spellStart"/>
-            <w:proofErr w:type="gramEnd"/>
             <w:r>
               <w:rPr>
                 <w:rFonts w:ascii="Consolas" w:hAnsi="Consolas"/>
@@ -11968,7 +11903,7 @@
     </w:p>
     <w:p>
       <w:pPr>
-        <w:pStyle w:val="Heading1"/>
+        <w:pStyle w:val="1"/>
       </w:pPr>
       <w:bookmarkStart w:id="15" w:name="_Toc33350374"/>
       <w:r>
@@ -12055,7 +11990,7 @@
     <w:p/>
     <w:p>
       <w:pPr>
-        <w:pStyle w:val="Heading1"/>
+        <w:pStyle w:val="1"/>
         <w:jc w:val="both"/>
         <w:rPr>
           <w:i/>
@@ -12296,10 +12231,1989 @@
         <w:t xml:space="preserve"> =” Dr. Shaheen”</w:t>
       </w:r>
     </w:p>
+    <w:tbl>
+      <w:tblPr>
+        <w:tblStyle w:val="a7"/>
+        <w:tblW w:w="8686" w:type="dxa"/>
+        <w:tblLook w:val="04A0" w:firstRow="1" w:lastRow="0" w:firstColumn="1" w:lastColumn="0" w:noHBand="0" w:noVBand="1"/>
+      </w:tblPr>
+      <w:tblGrid>
+        <w:gridCol w:w="4343"/>
+        <w:gridCol w:w="4343"/>
+      </w:tblGrid>
+      <w:tr>
+        <w:trPr>
+          <w:trHeight w:val="606"/>
+        </w:trPr>
+        <w:tc>
+          <w:tcPr>
+            <w:tcW w:w="4343" w:type="dxa"/>
+          </w:tcPr>
+          <w:p>
+            <w:pPr>
+              <w:rPr>
+                <w:color w:val="4F81BD" w:themeColor="accent1"/>
+              </w:rPr>
+            </w:pPr>
+            <w:r>
+              <w:rPr>
+                <w:color w:val="000000" w:themeColor="text1"/>
+              </w:rPr>
+              <w:t>SELECT</w:t>
+            </w:r>
+            <w:r>
+              <w:rPr>
+                <w:color w:val="4F81BD" w:themeColor="accent1"/>
+              </w:rPr>
+              <w:t xml:space="preserve"> </w:t>
+            </w:r>
+            <w:proofErr w:type="spellStart"/>
+            <w:r>
+              <w:rPr>
+                <w:color w:val="4F81BD" w:themeColor="accent1"/>
+              </w:rPr>
+              <w:t>Book_Code</w:t>
+            </w:r>
+            <w:proofErr w:type="spellEnd"/>
+            <w:r>
+              <w:rPr>
+                <w:color w:val="4F81BD" w:themeColor="accent1"/>
+              </w:rPr>
+              <w:t>, Title, Price, Stock</w:t>
+            </w:r>
+          </w:p>
+          <w:p>
+            <w:pPr>
+              <w:rPr>
+                <w:color w:val="4F81BD" w:themeColor="accent1"/>
+              </w:rPr>
+            </w:pPr>
+            <w:r>
+              <w:rPr>
+                <w:color w:val="000000" w:themeColor="text1"/>
+              </w:rPr>
+              <w:t>FROM</w:t>
+            </w:r>
+            <w:r>
+              <w:rPr>
+                <w:color w:val="4F81BD" w:themeColor="accent1"/>
+              </w:rPr>
+              <w:t xml:space="preserve"> Books</w:t>
+            </w:r>
+          </w:p>
+          <w:p>
+            <w:pPr>
+              <w:rPr>
+                <w:color w:val="4F81BD" w:themeColor="accent1"/>
+              </w:rPr>
+            </w:pPr>
+            <w:r>
+              <w:rPr>
+                <w:color w:val="000000" w:themeColor="text1"/>
+              </w:rPr>
+              <w:t xml:space="preserve">WHERE </w:t>
+            </w:r>
+            <w:r>
+              <w:rPr>
+                <w:color w:val="4F81BD" w:themeColor="accent1"/>
+              </w:rPr>
+              <w:t>Stock &lt;= 5</w:t>
+            </w:r>
+          </w:p>
+          <w:p>
+            <w:pPr>
+              <w:rPr>
+                <w:color w:val="4F81BD" w:themeColor="accent1"/>
+              </w:rPr>
+            </w:pPr>
+            <w:r>
+              <w:rPr>
+                <w:color w:val="000000" w:themeColor="text1"/>
+              </w:rPr>
+              <w:t xml:space="preserve">ORDER BY </w:t>
+            </w:r>
+            <w:r>
+              <w:rPr>
+                <w:color w:val="4F81BD" w:themeColor="accent1"/>
+              </w:rPr>
+              <w:t xml:space="preserve">Stock </w:t>
+            </w:r>
+            <w:r>
+              <w:rPr>
+                <w:color w:val="000000" w:themeColor="text1"/>
+              </w:rPr>
+              <w:t>ASC</w:t>
+            </w:r>
+            <w:r>
+              <w:rPr>
+                <w:color w:val="4F81BD" w:themeColor="accent1"/>
+              </w:rPr>
+              <w:t>;</w:t>
+            </w:r>
+          </w:p>
+        </w:tc>
+        <w:tc>
+          <w:tcPr>
+            <w:tcW w:w="4343" w:type="dxa"/>
+          </w:tcPr>
+          <w:p>
+            <w:pPr>
+              <w:rPr>
+                <w:i/>
+                <w:iCs/>
+                <w:color w:val="000000" w:themeColor="text1"/>
+                <w:rtl/>
+                <w:lang w:bidi="ar-SA"/>
+              </w:rPr>
+            </w:pPr>
+            <w:r>
+              <w:rPr>
+                <w:i/>
+                <w:iCs/>
+                <w:color w:val="000000" w:themeColor="text1"/>
+              </w:rPr>
+              <w:t>-- 1. Books with low or zero stock in the inventory</w:t>
+            </w:r>
+          </w:p>
+          <w:p>
+            <w:pPr>
+              <w:rPr>
+                <w:i/>
+                <w:iCs/>
+                <w:color w:val="4F81BD" w:themeColor="accent1"/>
+              </w:rPr>
+            </w:pPr>
+            <w:r>
+              <w:rPr>
+                <w:i/>
+                <w:iCs/>
+                <w:color w:val="000000" w:themeColor="text1"/>
+              </w:rPr>
+              <w:t xml:space="preserve"> -- (Assuming low stock is 5 or less)</w:t>
+            </w:r>
+          </w:p>
+        </w:tc>
+      </w:tr>
+      <w:tr>
+        <w:trPr>
+          <w:trHeight w:val="2298"/>
+        </w:trPr>
+        <w:tc>
+          <w:tcPr>
+            <w:tcW w:w="4343" w:type="dxa"/>
+          </w:tcPr>
+          <w:p>
+            <w:pPr>
+              <w:rPr>
+                <w:i/>
+                <w:iCs/>
+                <w:color w:val="4F81BD" w:themeColor="accent1"/>
+              </w:rPr>
+            </w:pPr>
+            <w:r>
+              <w:rPr>
+                <w:i/>
+                <w:iCs/>
+                <w:color w:val="000000" w:themeColor="text1"/>
+              </w:rPr>
+              <w:t>SELECT</w:t>
+            </w:r>
+            <w:r>
+              <w:rPr>
+                <w:i/>
+                <w:iCs/>
+                <w:color w:val="4F81BD" w:themeColor="accent1"/>
+              </w:rPr>
+              <w:t xml:space="preserve"> </w:t>
+            </w:r>
+            <w:proofErr w:type="spellStart"/>
+            <w:r>
+              <w:rPr>
+                <w:i/>
+                <w:iCs/>
+                <w:color w:val="4F81BD" w:themeColor="accent1"/>
+              </w:rPr>
+              <w:t>c.Category_Name</w:t>
+            </w:r>
+            <w:proofErr w:type="spellEnd"/>
+            <w:r>
+              <w:rPr>
+                <w:i/>
+                <w:iCs/>
+                <w:color w:val="4F81BD" w:themeColor="accent1"/>
+              </w:rPr>
+              <w:t xml:space="preserve">, </w:t>
+            </w:r>
+            <w:proofErr w:type="spellStart"/>
+            <w:r>
+              <w:rPr>
+                <w:i/>
+                <w:iCs/>
+                <w:color w:val="4F81BD" w:themeColor="accent1"/>
+              </w:rPr>
+              <w:t>b.Title</w:t>
+            </w:r>
+            <w:proofErr w:type="spellEnd"/>
+            <w:r>
+              <w:rPr>
+                <w:i/>
+                <w:iCs/>
+                <w:color w:val="4F81BD" w:themeColor="accent1"/>
+              </w:rPr>
+              <w:t xml:space="preserve">, </w:t>
+            </w:r>
+          </w:p>
+          <w:p>
+            <w:pPr>
+              <w:rPr>
+                <w:i/>
+                <w:iCs/>
+                <w:color w:val="4F81BD" w:themeColor="accent1"/>
+              </w:rPr>
+            </w:pPr>
+            <w:r>
+              <w:rPr>
+                <w:i/>
+                <w:iCs/>
+                <w:color w:val="4F81BD" w:themeColor="accent1"/>
+              </w:rPr>
+              <w:t xml:space="preserve">       (SELECT COUNT(*) </w:t>
+            </w:r>
+            <w:r>
+              <w:rPr>
+                <w:i/>
+                <w:iCs/>
+                <w:color w:val="000000" w:themeColor="text1"/>
+              </w:rPr>
+              <w:t xml:space="preserve">FROM </w:t>
+            </w:r>
+            <w:r>
+              <w:rPr>
+                <w:i/>
+                <w:iCs/>
+                <w:color w:val="4F81BD" w:themeColor="accent1"/>
+              </w:rPr>
+              <w:t xml:space="preserve">Borrow </w:t>
+            </w:r>
+            <w:proofErr w:type="spellStart"/>
+            <w:r>
+              <w:rPr>
+                <w:i/>
+                <w:iCs/>
+                <w:color w:val="4F81BD" w:themeColor="accent1"/>
+              </w:rPr>
+              <w:t>br</w:t>
+            </w:r>
+            <w:proofErr w:type="spellEnd"/>
+            <w:r>
+              <w:rPr>
+                <w:i/>
+                <w:iCs/>
+                <w:color w:val="4F81BD" w:themeColor="accent1"/>
+              </w:rPr>
+              <w:t xml:space="preserve"> </w:t>
+            </w:r>
+            <w:r>
+              <w:rPr>
+                <w:i/>
+                <w:iCs/>
+                <w:color w:val="000000" w:themeColor="text1"/>
+              </w:rPr>
+              <w:t>WHERE</w:t>
+            </w:r>
+            <w:r>
+              <w:rPr>
+                <w:i/>
+                <w:iCs/>
+                <w:color w:val="4F81BD" w:themeColor="accent1"/>
+              </w:rPr>
+              <w:t xml:space="preserve"> </w:t>
+            </w:r>
+            <w:proofErr w:type="spellStart"/>
+            <w:r>
+              <w:rPr>
+                <w:i/>
+                <w:iCs/>
+                <w:color w:val="4F81BD" w:themeColor="accent1"/>
+              </w:rPr>
+              <w:t>br.Book_Code</w:t>
+            </w:r>
+            <w:proofErr w:type="spellEnd"/>
+            <w:r>
+              <w:rPr>
+                <w:i/>
+                <w:iCs/>
+                <w:color w:val="4F81BD" w:themeColor="accent1"/>
+              </w:rPr>
+              <w:t xml:space="preserve"> = </w:t>
+            </w:r>
+            <w:proofErr w:type="spellStart"/>
+            <w:r>
+              <w:rPr>
+                <w:i/>
+                <w:iCs/>
+                <w:color w:val="4F81BD" w:themeColor="accent1"/>
+              </w:rPr>
+              <w:t>b.Book_Code</w:t>
+            </w:r>
+            <w:proofErr w:type="spellEnd"/>
+            <w:r>
+              <w:rPr>
+                <w:i/>
+                <w:iCs/>
+                <w:color w:val="4F81BD" w:themeColor="accent1"/>
+              </w:rPr>
+              <w:t xml:space="preserve">) + </w:t>
+            </w:r>
+          </w:p>
+          <w:p>
+            <w:pPr>
+              <w:rPr>
+                <w:i/>
+                <w:iCs/>
+                <w:color w:val="4F81BD" w:themeColor="accent1"/>
+              </w:rPr>
+            </w:pPr>
+            <w:r>
+              <w:rPr>
+                <w:i/>
+                <w:iCs/>
+                <w:color w:val="4F81BD" w:themeColor="accent1"/>
+              </w:rPr>
+              <w:t xml:space="preserve">       (SELECT COALESCE(SUM(</w:t>
+            </w:r>
+            <w:proofErr w:type="spellStart"/>
+            <w:r>
+              <w:rPr>
+                <w:i/>
+                <w:iCs/>
+                <w:color w:val="4F81BD" w:themeColor="accent1"/>
+              </w:rPr>
+              <w:t>p.Quantity</w:t>
+            </w:r>
+            <w:proofErr w:type="spellEnd"/>
+            <w:r>
+              <w:rPr>
+                <w:i/>
+                <w:iCs/>
+                <w:color w:val="4F81BD" w:themeColor="accent1"/>
+              </w:rPr>
+              <w:t xml:space="preserve">), 0) </w:t>
+            </w:r>
+            <w:r>
+              <w:rPr>
+                <w:i/>
+                <w:iCs/>
+                <w:color w:val="000000" w:themeColor="text1"/>
+              </w:rPr>
+              <w:t>FROM</w:t>
+            </w:r>
+            <w:r>
+              <w:rPr>
+                <w:i/>
+                <w:iCs/>
+                <w:color w:val="4F81BD" w:themeColor="accent1"/>
+              </w:rPr>
+              <w:t xml:space="preserve"> Purchase p </w:t>
+            </w:r>
+            <w:r>
+              <w:rPr>
+                <w:i/>
+                <w:iCs/>
+                <w:color w:val="000000" w:themeColor="text1"/>
+              </w:rPr>
+              <w:t xml:space="preserve">WHERE </w:t>
+            </w:r>
+            <w:proofErr w:type="spellStart"/>
+            <w:r>
+              <w:rPr>
+                <w:i/>
+                <w:iCs/>
+                <w:color w:val="4F81BD" w:themeColor="accent1"/>
+              </w:rPr>
+              <w:t>p.Book_Code</w:t>
+            </w:r>
+            <w:proofErr w:type="spellEnd"/>
+            <w:r>
+              <w:rPr>
+                <w:i/>
+                <w:iCs/>
+                <w:color w:val="4F81BD" w:themeColor="accent1"/>
+              </w:rPr>
+              <w:t xml:space="preserve"> = </w:t>
+            </w:r>
+            <w:proofErr w:type="spellStart"/>
+            <w:r>
+              <w:rPr>
+                <w:i/>
+                <w:iCs/>
+                <w:color w:val="4F81BD" w:themeColor="accent1"/>
+              </w:rPr>
+              <w:t>b.Book_Code</w:t>
+            </w:r>
+            <w:proofErr w:type="spellEnd"/>
+            <w:r>
+              <w:rPr>
+                <w:i/>
+                <w:iCs/>
+                <w:color w:val="4F81BD" w:themeColor="accent1"/>
+              </w:rPr>
+              <w:t xml:space="preserve">) AS </w:t>
+            </w:r>
+            <w:proofErr w:type="spellStart"/>
+            <w:r>
+              <w:rPr>
+                <w:i/>
+                <w:iCs/>
+                <w:color w:val="4F81BD" w:themeColor="accent1"/>
+              </w:rPr>
+              <w:t>Total_Transactions</w:t>
+            </w:r>
+            <w:proofErr w:type="spellEnd"/>
+          </w:p>
+          <w:p>
+            <w:pPr>
+              <w:rPr>
+                <w:i/>
+                <w:iCs/>
+                <w:color w:val="4F81BD" w:themeColor="accent1"/>
+              </w:rPr>
+            </w:pPr>
+            <w:r>
+              <w:rPr>
+                <w:i/>
+                <w:iCs/>
+                <w:color w:val="000000" w:themeColor="text1"/>
+              </w:rPr>
+              <w:t xml:space="preserve">FROM </w:t>
+            </w:r>
+            <w:r>
+              <w:rPr>
+                <w:i/>
+                <w:iCs/>
+                <w:color w:val="4F81BD" w:themeColor="accent1"/>
+              </w:rPr>
+              <w:t>Books b</w:t>
+            </w:r>
+          </w:p>
+          <w:p>
+            <w:pPr>
+              <w:rPr>
+                <w:i/>
+                <w:iCs/>
+                <w:color w:val="4F81BD" w:themeColor="accent1"/>
+              </w:rPr>
+            </w:pPr>
+            <w:r>
+              <w:rPr>
+                <w:i/>
+                <w:iCs/>
+                <w:color w:val="000000" w:themeColor="text1"/>
+              </w:rPr>
+              <w:t xml:space="preserve">JOIN </w:t>
+            </w:r>
+            <w:proofErr w:type="spellStart"/>
+            <w:r>
+              <w:rPr>
+                <w:i/>
+                <w:iCs/>
+                <w:color w:val="4F81BD" w:themeColor="accent1"/>
+              </w:rPr>
+              <w:t>Book_Categories</w:t>
+            </w:r>
+            <w:proofErr w:type="spellEnd"/>
+            <w:r>
+              <w:rPr>
+                <w:i/>
+                <w:iCs/>
+                <w:color w:val="4F81BD" w:themeColor="accent1"/>
+              </w:rPr>
+              <w:t xml:space="preserve"> </w:t>
+            </w:r>
+            <w:proofErr w:type="spellStart"/>
+            <w:r>
+              <w:rPr>
+                <w:i/>
+                <w:iCs/>
+                <w:color w:val="4F81BD" w:themeColor="accent1"/>
+              </w:rPr>
+              <w:t>bc</w:t>
+            </w:r>
+            <w:proofErr w:type="spellEnd"/>
+            <w:r>
+              <w:rPr>
+                <w:i/>
+                <w:iCs/>
+                <w:color w:val="4F81BD" w:themeColor="accent1"/>
+              </w:rPr>
+              <w:t xml:space="preserve"> </w:t>
+            </w:r>
+            <w:r>
+              <w:rPr>
+                <w:i/>
+                <w:iCs/>
+                <w:color w:val="000000" w:themeColor="text1"/>
+              </w:rPr>
+              <w:t xml:space="preserve">ON </w:t>
+            </w:r>
+            <w:proofErr w:type="spellStart"/>
+            <w:r>
+              <w:rPr>
+                <w:i/>
+                <w:iCs/>
+                <w:color w:val="4F81BD" w:themeColor="accent1"/>
+              </w:rPr>
+              <w:t>b.Book_Code</w:t>
+            </w:r>
+            <w:proofErr w:type="spellEnd"/>
+            <w:r>
+              <w:rPr>
+                <w:i/>
+                <w:iCs/>
+                <w:color w:val="4F81BD" w:themeColor="accent1"/>
+              </w:rPr>
+              <w:t xml:space="preserve"> = </w:t>
+            </w:r>
+            <w:proofErr w:type="spellStart"/>
+            <w:r>
+              <w:rPr>
+                <w:i/>
+                <w:iCs/>
+                <w:color w:val="4F81BD" w:themeColor="accent1"/>
+              </w:rPr>
+              <w:t>bc.Book_Code</w:t>
+            </w:r>
+            <w:proofErr w:type="spellEnd"/>
+          </w:p>
+          <w:p>
+            <w:pPr>
+              <w:rPr>
+                <w:i/>
+                <w:iCs/>
+                <w:color w:val="4F81BD" w:themeColor="accent1"/>
+              </w:rPr>
+            </w:pPr>
+            <w:r>
+              <w:rPr>
+                <w:i/>
+                <w:iCs/>
+                <w:color w:val="000000" w:themeColor="text1"/>
+              </w:rPr>
+              <w:t xml:space="preserve">JOIN </w:t>
+            </w:r>
+            <w:r>
+              <w:rPr>
+                <w:i/>
+                <w:iCs/>
+                <w:color w:val="4F81BD" w:themeColor="accent1"/>
+              </w:rPr>
+              <w:t xml:space="preserve">Categories c </w:t>
+            </w:r>
+            <w:r>
+              <w:rPr>
+                <w:i/>
+                <w:iCs/>
+                <w:color w:val="000000" w:themeColor="text1"/>
+              </w:rPr>
+              <w:t xml:space="preserve">ON </w:t>
+            </w:r>
+            <w:proofErr w:type="spellStart"/>
+            <w:r>
+              <w:rPr>
+                <w:i/>
+                <w:iCs/>
+                <w:color w:val="4F81BD" w:themeColor="accent1"/>
+              </w:rPr>
+              <w:t>bc.Category_ID</w:t>
+            </w:r>
+            <w:proofErr w:type="spellEnd"/>
+            <w:r>
+              <w:rPr>
+                <w:i/>
+                <w:iCs/>
+                <w:color w:val="4F81BD" w:themeColor="accent1"/>
+              </w:rPr>
+              <w:t xml:space="preserve"> = </w:t>
+            </w:r>
+            <w:proofErr w:type="spellStart"/>
+            <w:r>
+              <w:rPr>
+                <w:i/>
+                <w:iCs/>
+                <w:color w:val="4F81BD" w:themeColor="accent1"/>
+              </w:rPr>
+              <w:t>c.Category_ID</w:t>
+            </w:r>
+            <w:proofErr w:type="spellEnd"/>
+          </w:p>
+          <w:p>
+            <w:pPr>
+              <w:rPr>
+                <w:i/>
+                <w:iCs/>
+                <w:color w:val="4F81BD" w:themeColor="accent1"/>
+              </w:rPr>
+            </w:pPr>
+            <w:r>
+              <w:rPr>
+                <w:i/>
+                <w:iCs/>
+                <w:color w:val="000000" w:themeColor="text1"/>
+              </w:rPr>
+              <w:t xml:space="preserve">ORDER BY </w:t>
+            </w:r>
+            <w:proofErr w:type="spellStart"/>
+            <w:r>
+              <w:rPr>
+                <w:i/>
+                <w:iCs/>
+                <w:color w:val="4F81BD" w:themeColor="accent1"/>
+              </w:rPr>
+              <w:t>c.Category_Name</w:t>
+            </w:r>
+            <w:proofErr w:type="spellEnd"/>
+            <w:r>
+              <w:rPr>
+                <w:i/>
+                <w:iCs/>
+                <w:color w:val="4F81BD" w:themeColor="accent1"/>
+              </w:rPr>
+              <w:t xml:space="preserve">, </w:t>
+            </w:r>
+            <w:proofErr w:type="spellStart"/>
+            <w:r>
+              <w:rPr>
+                <w:i/>
+                <w:iCs/>
+                <w:color w:val="4F81BD" w:themeColor="accent1"/>
+              </w:rPr>
+              <w:t>Total_Transactions</w:t>
+            </w:r>
+            <w:proofErr w:type="spellEnd"/>
+            <w:r>
+              <w:rPr>
+                <w:i/>
+                <w:iCs/>
+                <w:color w:val="4F81BD" w:themeColor="accent1"/>
+              </w:rPr>
+              <w:t xml:space="preserve"> </w:t>
+            </w:r>
+            <w:r>
+              <w:rPr>
+                <w:i/>
+                <w:iCs/>
+                <w:color w:val="000000" w:themeColor="text1"/>
+              </w:rPr>
+              <w:t>DESC</w:t>
+            </w:r>
+            <w:r>
+              <w:rPr>
+                <w:i/>
+                <w:iCs/>
+                <w:color w:val="4F81BD" w:themeColor="accent1"/>
+              </w:rPr>
+              <w:t>;</w:t>
+            </w:r>
+          </w:p>
+        </w:tc>
+        <w:tc>
+          <w:tcPr>
+            <w:tcW w:w="4343" w:type="dxa"/>
+          </w:tcPr>
+          <w:p>
+            <w:pPr>
+              <w:rPr>
+                <w:i/>
+                <w:iCs/>
+                <w:color w:val="4F81BD" w:themeColor="accent1"/>
+              </w:rPr>
+            </w:pPr>
+            <w:r>
+              <w:rPr>
+                <w:i/>
+                <w:iCs/>
+                <w:color w:val="000000" w:themeColor="text1"/>
+              </w:rPr>
+              <w:t>-- 2. Most borrowed/purchased books by category</w:t>
+            </w:r>
+          </w:p>
+        </w:tc>
+      </w:tr>
+      <w:tr>
+        <w:trPr>
+          <w:trHeight w:val="606"/>
+        </w:trPr>
+        <w:tc>
+          <w:tcPr>
+            <w:tcW w:w="4343" w:type="dxa"/>
+          </w:tcPr>
+          <w:p>
+            <w:pPr>
+              <w:rPr>
+                <w:i/>
+                <w:iCs/>
+                <w:color w:val="4F81BD" w:themeColor="accent1"/>
+              </w:rPr>
+            </w:pPr>
+            <w:r>
+              <w:rPr>
+                <w:i/>
+                <w:iCs/>
+                <w:color w:val="000000" w:themeColor="text1"/>
+              </w:rPr>
+              <w:t xml:space="preserve">SELECT </w:t>
+            </w:r>
+            <w:r>
+              <w:rPr>
+                <w:i/>
+                <w:iCs/>
+                <w:color w:val="4F81BD" w:themeColor="accent1"/>
+              </w:rPr>
+              <w:t>COUNT(</w:t>
+            </w:r>
+            <w:r>
+              <w:rPr>
+                <w:i/>
+                <w:iCs/>
+                <w:color w:val="000000" w:themeColor="text1"/>
+              </w:rPr>
+              <w:t xml:space="preserve">DISTINCT </w:t>
+            </w:r>
+            <w:proofErr w:type="spellStart"/>
+            <w:r>
+              <w:rPr>
+                <w:i/>
+                <w:iCs/>
+                <w:color w:val="4F81BD" w:themeColor="accent1"/>
+              </w:rPr>
+              <w:t>Authors_ID</w:t>
+            </w:r>
+            <w:proofErr w:type="spellEnd"/>
+            <w:r>
+              <w:rPr>
+                <w:i/>
+                <w:iCs/>
+                <w:color w:val="4F81BD" w:themeColor="accent1"/>
+              </w:rPr>
+              <w:t xml:space="preserve">) </w:t>
+            </w:r>
+            <w:r>
+              <w:rPr>
+                <w:i/>
+                <w:iCs/>
+                <w:color w:val="000000" w:themeColor="text1"/>
+              </w:rPr>
+              <w:t xml:space="preserve">AS </w:t>
+            </w:r>
+            <w:proofErr w:type="spellStart"/>
+            <w:r>
+              <w:rPr>
+                <w:i/>
+                <w:iCs/>
+                <w:color w:val="4F81BD" w:themeColor="accent1"/>
+              </w:rPr>
+              <w:t>Published_Authors_Count</w:t>
+            </w:r>
+            <w:proofErr w:type="spellEnd"/>
+          </w:p>
+          <w:p>
+            <w:pPr>
+              <w:rPr>
+                <w:i/>
+                <w:iCs/>
+                <w:color w:val="4F81BD" w:themeColor="accent1"/>
+              </w:rPr>
+            </w:pPr>
+            <w:r>
+              <w:rPr>
+                <w:i/>
+                <w:iCs/>
+                <w:color w:val="000000" w:themeColor="text1"/>
+              </w:rPr>
+              <w:t xml:space="preserve">FROM </w:t>
+            </w:r>
+            <w:proofErr w:type="spellStart"/>
+            <w:r>
+              <w:rPr>
+                <w:i/>
+                <w:iCs/>
+                <w:color w:val="4F81BD" w:themeColor="accent1"/>
+              </w:rPr>
+              <w:t>Book_Authors</w:t>
+            </w:r>
+            <w:proofErr w:type="spellEnd"/>
+            <w:r>
+              <w:rPr>
+                <w:i/>
+                <w:iCs/>
+                <w:color w:val="4F81BD" w:themeColor="accent1"/>
+              </w:rPr>
+              <w:t>;</w:t>
+            </w:r>
+          </w:p>
+        </w:tc>
+        <w:tc>
+          <w:tcPr>
+            <w:tcW w:w="4343" w:type="dxa"/>
+          </w:tcPr>
+          <w:p>
+            <w:pPr>
+              <w:rPr>
+                <w:i/>
+                <w:iCs/>
+                <w:color w:val="000000" w:themeColor="text1"/>
+              </w:rPr>
+            </w:pPr>
+            <w:r>
+              <w:rPr>
+                <w:i/>
+                <w:iCs/>
+                <w:color w:val="000000" w:themeColor="text1"/>
+              </w:rPr>
+              <w:t>-- 3. Number of authors who published their books in the library</w:t>
+            </w:r>
+          </w:p>
+        </w:tc>
+      </w:tr>
+      <w:tr>
+        <w:trPr>
+          <w:trHeight w:val="606"/>
+        </w:trPr>
+        <w:tc>
+          <w:tcPr>
+            <w:tcW w:w="4343" w:type="dxa"/>
+          </w:tcPr>
+          <w:p>
+            <w:pPr>
+              <w:rPr>
+                <w:i/>
+                <w:iCs/>
+                <w:color w:val="4F81BD" w:themeColor="accent1"/>
+              </w:rPr>
+            </w:pPr>
+            <w:r>
+              <w:rPr>
+                <w:i/>
+                <w:iCs/>
+                <w:color w:val="000000" w:themeColor="text1"/>
+              </w:rPr>
+              <w:t xml:space="preserve">SELECT </w:t>
+            </w:r>
+            <w:r>
+              <w:rPr>
+                <w:i/>
+                <w:iCs/>
+                <w:color w:val="4F81BD" w:themeColor="accent1"/>
+              </w:rPr>
+              <w:t xml:space="preserve">'Customers' </w:t>
+            </w:r>
+            <w:r>
+              <w:rPr>
+                <w:i/>
+                <w:iCs/>
+                <w:color w:val="000000" w:themeColor="text1"/>
+              </w:rPr>
+              <w:t xml:space="preserve">AS </w:t>
+            </w:r>
+            <w:proofErr w:type="spellStart"/>
+            <w:r>
+              <w:rPr>
+                <w:i/>
+                <w:iCs/>
+                <w:color w:val="4F81BD" w:themeColor="accent1"/>
+              </w:rPr>
+              <w:t>User_Type</w:t>
+            </w:r>
+            <w:proofErr w:type="spellEnd"/>
+            <w:r>
+              <w:rPr>
+                <w:i/>
+                <w:iCs/>
+                <w:color w:val="4F81BD" w:themeColor="accent1"/>
+              </w:rPr>
+              <w:t xml:space="preserve">, COUNT(*) </w:t>
+            </w:r>
+            <w:r>
+              <w:rPr>
+                <w:i/>
+                <w:iCs/>
+                <w:color w:val="000000" w:themeColor="text1"/>
+              </w:rPr>
+              <w:t xml:space="preserve">AS </w:t>
+            </w:r>
+            <w:proofErr w:type="spellStart"/>
+            <w:r>
+              <w:rPr>
+                <w:i/>
+                <w:iCs/>
+                <w:color w:val="4F81BD" w:themeColor="accent1"/>
+              </w:rPr>
+              <w:t>Total_Count</w:t>
+            </w:r>
+            <w:proofErr w:type="spellEnd"/>
+            <w:r>
+              <w:rPr>
+                <w:i/>
+                <w:iCs/>
+                <w:color w:val="4F81BD" w:themeColor="accent1"/>
+              </w:rPr>
+              <w:t xml:space="preserve"> FROM Customer</w:t>
+            </w:r>
+          </w:p>
+          <w:p>
+            <w:pPr>
+              <w:rPr>
+                <w:i/>
+                <w:iCs/>
+                <w:color w:val="000000" w:themeColor="text1"/>
+              </w:rPr>
+            </w:pPr>
+            <w:r>
+              <w:rPr>
+                <w:i/>
+                <w:iCs/>
+                <w:color w:val="000000" w:themeColor="text1"/>
+              </w:rPr>
+              <w:t>UNION</w:t>
+            </w:r>
+          </w:p>
+          <w:p>
+            <w:pPr>
+              <w:rPr>
+                <w:i/>
+                <w:iCs/>
+                <w:color w:val="4F81BD" w:themeColor="accent1"/>
+                <w:rtl/>
+                <w:lang w:bidi="ar-SA"/>
+              </w:rPr>
+            </w:pPr>
+            <w:r>
+              <w:rPr>
+                <w:i/>
+                <w:iCs/>
+                <w:color w:val="000000" w:themeColor="text1"/>
+              </w:rPr>
+              <w:t xml:space="preserve">SELECT </w:t>
+            </w:r>
+            <w:r>
+              <w:rPr>
+                <w:i/>
+                <w:iCs/>
+                <w:color w:val="4F81BD" w:themeColor="accent1"/>
+              </w:rPr>
+              <w:t xml:space="preserve">'Employees' </w:t>
+            </w:r>
+            <w:r>
+              <w:rPr>
+                <w:i/>
+                <w:iCs/>
+                <w:color w:val="000000" w:themeColor="text1"/>
+              </w:rPr>
+              <w:t xml:space="preserve">AS </w:t>
+            </w:r>
+            <w:proofErr w:type="spellStart"/>
+            <w:r>
+              <w:rPr>
+                <w:i/>
+                <w:iCs/>
+                <w:color w:val="4F81BD" w:themeColor="accent1"/>
+              </w:rPr>
+              <w:t>User_Type</w:t>
+            </w:r>
+            <w:proofErr w:type="spellEnd"/>
+            <w:r>
+              <w:rPr>
+                <w:i/>
+                <w:iCs/>
+                <w:color w:val="4F81BD" w:themeColor="accent1"/>
+              </w:rPr>
+              <w:t xml:space="preserve">, COUNT(*) </w:t>
+            </w:r>
+            <w:r>
+              <w:rPr>
+                <w:i/>
+                <w:iCs/>
+                <w:color w:val="000000" w:themeColor="text1"/>
+              </w:rPr>
+              <w:t xml:space="preserve">AS </w:t>
+            </w:r>
+            <w:proofErr w:type="spellStart"/>
+            <w:r>
+              <w:rPr>
+                <w:i/>
+                <w:iCs/>
+                <w:color w:val="4F81BD" w:themeColor="accent1"/>
+              </w:rPr>
+              <w:t>Total_Count</w:t>
+            </w:r>
+            <w:proofErr w:type="spellEnd"/>
+            <w:r>
+              <w:rPr>
+                <w:i/>
+                <w:iCs/>
+                <w:color w:val="4F81BD" w:themeColor="accent1"/>
+              </w:rPr>
+              <w:t xml:space="preserve"> FROM Employees;</w:t>
+            </w:r>
+          </w:p>
+          <w:p>
+            <w:pPr>
+              <w:rPr>
+                <w:i/>
+                <w:iCs/>
+                <w:color w:val="000000" w:themeColor="text1"/>
+                <w:rtl/>
+                <w:lang w:bidi="ar-SA"/>
+              </w:rPr>
+            </w:pPr>
+            <w:r>
+              <w:rPr>
+                <w:i/>
+                <w:iCs/>
+                <w:color w:val="000000" w:themeColor="text1"/>
+                <w:lang w:bidi="ar-SA"/>
+              </w:rPr>
+              <w:t>B :</w:t>
+            </w:r>
+          </w:p>
+          <w:p>
+            <w:pPr>
+              <w:rPr>
+                <w:i/>
+                <w:iCs/>
+                <w:color w:val="4F81BD" w:themeColor="accent1"/>
+                <w:lang w:bidi="ar-SA"/>
+              </w:rPr>
+            </w:pPr>
+            <w:r>
+              <w:rPr>
+                <w:i/>
+                <w:iCs/>
+                <w:color w:val="000000" w:themeColor="text1"/>
+                <w:lang w:bidi="ar-SA"/>
+              </w:rPr>
+              <w:t xml:space="preserve">SELECT </w:t>
+            </w:r>
+            <w:r>
+              <w:rPr>
+                <w:i/>
+                <w:iCs/>
+                <w:color w:val="4F81BD" w:themeColor="accent1"/>
+                <w:lang w:bidi="ar-SA"/>
+              </w:rPr>
+              <w:t xml:space="preserve">ID, Name, Email, Gender, </w:t>
+            </w:r>
+            <w:proofErr w:type="spellStart"/>
+            <w:r>
+              <w:rPr>
+                <w:i/>
+                <w:iCs/>
+                <w:color w:val="4F81BD" w:themeColor="accent1"/>
+                <w:lang w:bidi="ar-SA"/>
+              </w:rPr>
+              <w:t>Birth_Date</w:t>
+            </w:r>
+            <w:proofErr w:type="spellEnd"/>
+            <w:r>
+              <w:rPr>
+                <w:i/>
+                <w:iCs/>
+                <w:color w:val="4F81BD" w:themeColor="accent1"/>
+                <w:lang w:bidi="ar-SA"/>
+              </w:rPr>
+              <w:t xml:space="preserve">, Address </w:t>
+            </w:r>
+            <w:r>
+              <w:rPr>
+                <w:i/>
+                <w:iCs/>
+                <w:color w:val="000000" w:themeColor="text1"/>
+                <w:lang w:bidi="ar-SA"/>
+              </w:rPr>
+              <w:t xml:space="preserve">FROM </w:t>
+            </w:r>
+            <w:r>
+              <w:rPr>
+                <w:i/>
+                <w:iCs/>
+                <w:color w:val="4F81BD" w:themeColor="accent1"/>
+                <w:lang w:bidi="ar-SA"/>
+              </w:rPr>
+              <w:t>Customer;</w:t>
+            </w:r>
+          </w:p>
+          <w:p>
+            <w:pPr>
+              <w:rPr>
+                <w:i/>
+                <w:iCs/>
+                <w:color w:val="4F81BD" w:themeColor="accent1"/>
+                <w:lang w:bidi="ar-SA"/>
+              </w:rPr>
+            </w:pPr>
+          </w:p>
+          <w:p>
+            <w:pPr>
+              <w:rPr>
+                <w:i/>
+                <w:iCs/>
+                <w:color w:val="000000" w:themeColor="text1"/>
+                <w:lang w:bidi="ar-SA"/>
+              </w:rPr>
+            </w:pPr>
+          </w:p>
+          <w:p>
+            <w:pPr>
+              <w:rPr>
+                <w:i/>
+                <w:iCs/>
+                <w:color w:val="000000" w:themeColor="text1"/>
+                <w:lang w:bidi="ar-SA"/>
+              </w:rPr>
+            </w:pPr>
+            <w:r>
+              <w:rPr>
+                <w:i/>
+                <w:iCs/>
+                <w:color w:val="000000" w:themeColor="text1"/>
+                <w:lang w:bidi="ar-SA"/>
+              </w:rPr>
+              <w:lastRenderedPageBreak/>
+              <w:t>C :</w:t>
+            </w:r>
+          </w:p>
+          <w:p>
+            <w:pPr>
+              <w:rPr>
+                <w:i/>
+                <w:iCs/>
+                <w:color w:val="4F81BD" w:themeColor="accent1"/>
+                <w:lang w:bidi="ar-SA"/>
+              </w:rPr>
+            </w:pPr>
+            <w:r>
+              <w:rPr>
+                <w:i/>
+                <w:iCs/>
+                <w:color w:val="000000" w:themeColor="text1"/>
+                <w:lang w:bidi="ar-SA"/>
+              </w:rPr>
+              <w:t xml:space="preserve">SELECT </w:t>
+            </w:r>
+            <w:proofErr w:type="spellStart"/>
+            <w:r>
+              <w:rPr>
+                <w:i/>
+                <w:iCs/>
+                <w:color w:val="4F81BD" w:themeColor="accent1"/>
+                <w:lang w:bidi="ar-SA"/>
+              </w:rPr>
+              <w:t>Employee_ID</w:t>
+            </w:r>
+            <w:proofErr w:type="spellEnd"/>
+            <w:r>
+              <w:rPr>
+                <w:i/>
+                <w:iCs/>
+                <w:color w:val="4F81BD" w:themeColor="accent1"/>
+                <w:lang w:bidi="ar-SA"/>
+              </w:rPr>
+              <w:t xml:space="preserve">, Name, Email, Salary, </w:t>
+            </w:r>
+            <w:proofErr w:type="spellStart"/>
+            <w:r>
+              <w:rPr>
+                <w:i/>
+                <w:iCs/>
+                <w:color w:val="4F81BD" w:themeColor="accent1"/>
+                <w:lang w:bidi="ar-SA"/>
+              </w:rPr>
+              <w:t>Work_Hours</w:t>
+            </w:r>
+            <w:proofErr w:type="spellEnd"/>
+            <w:r>
+              <w:rPr>
+                <w:i/>
+                <w:iCs/>
+                <w:color w:val="4F81BD" w:themeColor="accent1"/>
+                <w:lang w:bidi="ar-SA"/>
+              </w:rPr>
+              <w:t xml:space="preserve">, </w:t>
+            </w:r>
+            <w:proofErr w:type="spellStart"/>
+            <w:r>
+              <w:rPr>
+                <w:i/>
+                <w:iCs/>
+                <w:color w:val="4F81BD" w:themeColor="accent1"/>
+                <w:lang w:bidi="ar-SA"/>
+              </w:rPr>
+              <w:t>Dept_ID</w:t>
+            </w:r>
+            <w:proofErr w:type="spellEnd"/>
+            <w:r>
+              <w:rPr>
+                <w:i/>
+                <w:iCs/>
+                <w:color w:val="4F81BD" w:themeColor="accent1"/>
+                <w:lang w:bidi="ar-SA"/>
+              </w:rPr>
+              <w:t xml:space="preserve"> </w:t>
+            </w:r>
+            <w:r>
+              <w:rPr>
+                <w:i/>
+                <w:iCs/>
+                <w:color w:val="000000" w:themeColor="text1"/>
+                <w:lang w:bidi="ar-SA"/>
+              </w:rPr>
+              <w:t xml:space="preserve">FROM </w:t>
+            </w:r>
+            <w:r>
+              <w:rPr>
+                <w:i/>
+                <w:iCs/>
+                <w:color w:val="4F81BD" w:themeColor="accent1"/>
+                <w:lang w:bidi="ar-SA"/>
+              </w:rPr>
+              <w:t>Employees;</w:t>
+            </w:r>
+          </w:p>
+        </w:tc>
+        <w:tc>
+          <w:tcPr>
+            <w:tcW w:w="4343" w:type="dxa"/>
+          </w:tcPr>
+          <w:p>
+            <w:pPr>
+              <w:rPr>
+                <w:i/>
+                <w:iCs/>
+                <w:color w:val="000000" w:themeColor="text1"/>
+                <w:rtl/>
+                <w:lang w:bidi="ar-SA"/>
+              </w:rPr>
+            </w:pPr>
+            <w:r>
+              <w:rPr>
+                <w:i/>
+                <w:iCs/>
+                <w:color w:val="000000" w:themeColor="text1"/>
+              </w:rPr>
+              <w:lastRenderedPageBreak/>
+              <w:t>-- 4. Number of customers and employees</w:t>
+            </w:r>
+          </w:p>
+          <w:p>
+            <w:pPr>
+              <w:rPr>
+                <w:i/>
+                <w:iCs/>
+                <w:color w:val="000000" w:themeColor="text1"/>
+                <w:rtl/>
+                <w:lang w:bidi="ar-SA"/>
+              </w:rPr>
+            </w:pPr>
+            <w:r>
+              <w:rPr>
+                <w:i/>
+                <w:iCs/>
+                <w:color w:val="000000" w:themeColor="text1"/>
+              </w:rPr>
+              <w:t xml:space="preserve"> -- Query A: Get the total count of both customers and employees</w:t>
+            </w:r>
+          </w:p>
+          <w:p>
+            <w:pPr>
+              <w:rPr>
+                <w:i/>
+                <w:iCs/>
+                <w:color w:val="000000" w:themeColor="text1"/>
+                <w:rtl/>
+                <w:lang w:bidi="ar-SA"/>
+              </w:rPr>
+            </w:pPr>
+            <w:r>
+              <w:rPr>
+                <w:i/>
+                <w:iCs/>
+                <w:color w:val="000000" w:themeColor="text1"/>
+                <w:lang w:bidi="ar-SA"/>
+              </w:rPr>
+              <w:t>-- Query B: Display customer details</w:t>
+            </w:r>
+          </w:p>
+          <w:p>
+            <w:pPr>
+              <w:rPr>
+                <w:i/>
+                <w:iCs/>
+                <w:color w:val="000000" w:themeColor="text1"/>
+                <w:lang w:bidi="ar-SA"/>
+              </w:rPr>
+            </w:pPr>
+            <w:r>
+              <w:rPr>
+                <w:i/>
+                <w:iCs/>
+                <w:color w:val="000000" w:themeColor="text1"/>
+                <w:lang w:bidi="ar-SA"/>
+              </w:rPr>
+              <w:t>-- Query C: Display employee details</w:t>
+            </w:r>
+          </w:p>
+        </w:tc>
+      </w:tr>
+      <w:tr>
+        <w:trPr>
+          <w:trHeight w:val="606"/>
+        </w:trPr>
+        <w:tc>
+          <w:tcPr>
+            <w:tcW w:w="4343" w:type="dxa"/>
+          </w:tcPr>
+          <w:p>
+            <w:pPr>
+              <w:rPr>
+                <w:i/>
+                <w:iCs/>
+                <w:color w:val="4F81BD" w:themeColor="accent1"/>
+              </w:rPr>
+            </w:pPr>
+            <w:r>
+              <w:rPr>
+                <w:i/>
+                <w:iCs/>
+                <w:color w:val="000000" w:themeColor="text1"/>
+              </w:rPr>
+              <w:t xml:space="preserve">SELECT </w:t>
+            </w:r>
+            <w:proofErr w:type="spellStart"/>
+            <w:r>
+              <w:rPr>
+                <w:i/>
+                <w:iCs/>
+                <w:color w:val="4F81BD" w:themeColor="accent1"/>
+              </w:rPr>
+              <w:t>o.Order_Number</w:t>
+            </w:r>
+            <w:proofErr w:type="spellEnd"/>
+            <w:r>
+              <w:rPr>
+                <w:i/>
+                <w:iCs/>
+                <w:color w:val="4F81BD" w:themeColor="accent1"/>
+              </w:rPr>
+              <w:t xml:space="preserve">, </w:t>
+            </w:r>
+            <w:proofErr w:type="spellStart"/>
+            <w:r>
+              <w:rPr>
+                <w:i/>
+                <w:iCs/>
+                <w:color w:val="4F81BD" w:themeColor="accent1"/>
+              </w:rPr>
+              <w:t>o.Order_Date</w:t>
+            </w:r>
+            <w:proofErr w:type="spellEnd"/>
+            <w:r>
+              <w:rPr>
+                <w:i/>
+                <w:iCs/>
+                <w:color w:val="4F81BD" w:themeColor="accent1"/>
+              </w:rPr>
+              <w:t xml:space="preserve">, </w:t>
+            </w:r>
+            <w:proofErr w:type="spellStart"/>
+            <w:r>
+              <w:rPr>
+                <w:i/>
+                <w:iCs/>
+                <w:color w:val="4F81BD" w:themeColor="accent1"/>
+              </w:rPr>
+              <w:t>o.Total_Price</w:t>
+            </w:r>
+            <w:proofErr w:type="spellEnd"/>
+            <w:r>
+              <w:rPr>
+                <w:i/>
+                <w:iCs/>
+                <w:color w:val="4F81BD" w:themeColor="accent1"/>
+              </w:rPr>
+              <w:t xml:space="preserve">, </w:t>
+            </w:r>
+            <w:proofErr w:type="spellStart"/>
+            <w:r>
+              <w:rPr>
+                <w:i/>
+                <w:iCs/>
+                <w:color w:val="4F81BD" w:themeColor="accent1"/>
+              </w:rPr>
+              <w:t>c.Name</w:t>
+            </w:r>
+            <w:proofErr w:type="spellEnd"/>
+            <w:r>
+              <w:rPr>
+                <w:i/>
+                <w:iCs/>
+                <w:color w:val="4F81BD" w:themeColor="accent1"/>
+              </w:rPr>
+              <w:t xml:space="preserve"> </w:t>
+            </w:r>
+            <w:r>
+              <w:rPr>
+                <w:i/>
+                <w:iCs/>
+                <w:color w:val="000000" w:themeColor="text1"/>
+              </w:rPr>
+              <w:t xml:space="preserve">AS </w:t>
+            </w:r>
+            <w:proofErr w:type="spellStart"/>
+            <w:r>
+              <w:rPr>
+                <w:i/>
+                <w:iCs/>
+                <w:color w:val="4F81BD" w:themeColor="accent1"/>
+              </w:rPr>
+              <w:t>Customer_Name</w:t>
+            </w:r>
+            <w:proofErr w:type="spellEnd"/>
+            <w:r>
+              <w:rPr>
+                <w:i/>
+                <w:iCs/>
+                <w:color w:val="4F81BD" w:themeColor="accent1"/>
+              </w:rPr>
+              <w:t xml:space="preserve">, </w:t>
+            </w:r>
+            <w:proofErr w:type="spellStart"/>
+            <w:r>
+              <w:rPr>
+                <w:i/>
+                <w:iCs/>
+                <w:color w:val="4F81BD" w:themeColor="accent1"/>
+              </w:rPr>
+              <w:t>c.Email</w:t>
+            </w:r>
+            <w:proofErr w:type="spellEnd"/>
+          </w:p>
+          <w:p>
+            <w:pPr>
+              <w:rPr>
+                <w:i/>
+                <w:iCs/>
+                <w:color w:val="4F81BD" w:themeColor="accent1"/>
+              </w:rPr>
+            </w:pPr>
+            <w:r>
+              <w:rPr>
+                <w:i/>
+                <w:iCs/>
+                <w:color w:val="000000" w:themeColor="text1"/>
+              </w:rPr>
+              <w:t xml:space="preserve">FROM </w:t>
+            </w:r>
+            <w:r>
+              <w:rPr>
+                <w:i/>
+                <w:iCs/>
+                <w:color w:val="4F81BD" w:themeColor="accent1"/>
+              </w:rPr>
+              <w:t>Orders o</w:t>
+            </w:r>
+          </w:p>
+          <w:p>
+            <w:pPr>
+              <w:rPr>
+                <w:i/>
+                <w:iCs/>
+                <w:color w:val="4F81BD" w:themeColor="accent1"/>
+              </w:rPr>
+            </w:pPr>
+            <w:r>
+              <w:rPr>
+                <w:i/>
+                <w:iCs/>
+                <w:color w:val="000000" w:themeColor="text1"/>
+              </w:rPr>
+              <w:t xml:space="preserve">JOIN </w:t>
+            </w:r>
+            <w:r>
+              <w:rPr>
+                <w:i/>
+                <w:iCs/>
+                <w:color w:val="4F81BD" w:themeColor="accent1"/>
+              </w:rPr>
+              <w:t xml:space="preserve">Customer c </w:t>
+            </w:r>
+            <w:r>
+              <w:rPr>
+                <w:i/>
+                <w:iCs/>
+                <w:color w:val="000000" w:themeColor="text1"/>
+              </w:rPr>
+              <w:t xml:space="preserve">ON </w:t>
+            </w:r>
+            <w:proofErr w:type="spellStart"/>
+            <w:r>
+              <w:rPr>
+                <w:i/>
+                <w:iCs/>
+                <w:color w:val="4F81BD" w:themeColor="accent1"/>
+              </w:rPr>
+              <w:t>o.Customer_ID</w:t>
+            </w:r>
+            <w:proofErr w:type="spellEnd"/>
+            <w:r>
+              <w:rPr>
+                <w:i/>
+                <w:iCs/>
+                <w:color w:val="4F81BD" w:themeColor="accent1"/>
+              </w:rPr>
+              <w:t xml:space="preserve"> = c.ID</w:t>
+            </w:r>
+          </w:p>
+          <w:p>
+            <w:pPr>
+              <w:rPr>
+                <w:i/>
+                <w:iCs/>
+                <w:color w:val="4F81BD" w:themeColor="accent1"/>
+              </w:rPr>
+            </w:pPr>
+            <w:r>
+              <w:rPr>
+                <w:i/>
+                <w:iCs/>
+                <w:color w:val="000000" w:themeColor="text1"/>
+              </w:rPr>
+              <w:t xml:space="preserve">ORDER BY </w:t>
+            </w:r>
+            <w:proofErr w:type="spellStart"/>
+            <w:r>
+              <w:rPr>
+                <w:i/>
+                <w:iCs/>
+                <w:color w:val="4F81BD" w:themeColor="accent1"/>
+              </w:rPr>
+              <w:t>o.Order_Date</w:t>
+            </w:r>
+            <w:proofErr w:type="spellEnd"/>
+            <w:r>
+              <w:rPr>
+                <w:i/>
+                <w:iCs/>
+                <w:color w:val="4F81BD" w:themeColor="accent1"/>
+              </w:rPr>
+              <w:t xml:space="preserve"> </w:t>
+            </w:r>
+            <w:r>
+              <w:rPr>
+                <w:i/>
+                <w:iCs/>
+                <w:color w:val="000000" w:themeColor="text1"/>
+              </w:rPr>
+              <w:t>DESC</w:t>
+            </w:r>
+            <w:r>
+              <w:rPr>
+                <w:i/>
+                <w:iCs/>
+                <w:color w:val="4F81BD" w:themeColor="accent1"/>
+              </w:rPr>
+              <w:t>;</w:t>
+            </w:r>
+          </w:p>
+        </w:tc>
+        <w:tc>
+          <w:tcPr>
+            <w:tcW w:w="4343" w:type="dxa"/>
+          </w:tcPr>
+          <w:p>
+            <w:pPr>
+              <w:rPr>
+                <w:i/>
+                <w:iCs/>
+                <w:color w:val="4F81BD" w:themeColor="accent1"/>
+              </w:rPr>
+            </w:pPr>
+            <w:r>
+              <w:rPr>
+                <w:i/>
+                <w:iCs/>
+                <w:color w:val="000000" w:themeColor="text1"/>
+              </w:rPr>
+              <w:t>-- 5. Orders details, for whom and when</w:t>
+            </w:r>
+          </w:p>
+        </w:tc>
+      </w:tr>
+      <w:tr>
+        <w:trPr>
+          <w:trHeight w:val="606"/>
+        </w:trPr>
+        <w:tc>
+          <w:tcPr>
+            <w:tcW w:w="4343" w:type="dxa"/>
+          </w:tcPr>
+          <w:p>
+            <w:pPr>
+              <w:rPr>
+                <w:i/>
+                <w:iCs/>
+                <w:color w:val="4F81BD" w:themeColor="accent1"/>
+              </w:rPr>
+            </w:pPr>
+            <w:r>
+              <w:rPr>
+                <w:i/>
+                <w:iCs/>
+                <w:color w:val="000000" w:themeColor="text1"/>
+              </w:rPr>
+              <w:t xml:space="preserve">SELECT </w:t>
+            </w:r>
+            <w:proofErr w:type="spellStart"/>
+            <w:r>
+              <w:rPr>
+                <w:i/>
+                <w:iCs/>
+                <w:color w:val="4F81BD" w:themeColor="accent1"/>
+              </w:rPr>
+              <w:t>d.Dept_Name</w:t>
+            </w:r>
+            <w:proofErr w:type="spellEnd"/>
+            <w:r>
+              <w:rPr>
+                <w:i/>
+                <w:iCs/>
+                <w:color w:val="4F81BD" w:themeColor="accent1"/>
+              </w:rPr>
+              <w:t xml:space="preserve">, </w:t>
+            </w:r>
+            <w:proofErr w:type="spellStart"/>
+            <w:r>
+              <w:rPr>
+                <w:i/>
+                <w:iCs/>
+                <w:color w:val="4F81BD" w:themeColor="accent1"/>
+              </w:rPr>
+              <w:t>m.Name</w:t>
+            </w:r>
+            <w:proofErr w:type="spellEnd"/>
+            <w:r>
+              <w:rPr>
+                <w:i/>
+                <w:iCs/>
+                <w:color w:val="4F81BD" w:themeColor="accent1"/>
+              </w:rPr>
+              <w:t xml:space="preserve"> </w:t>
+            </w:r>
+            <w:r>
+              <w:rPr>
+                <w:i/>
+                <w:iCs/>
+                <w:color w:val="000000" w:themeColor="text1"/>
+              </w:rPr>
+              <w:t xml:space="preserve">AS </w:t>
+            </w:r>
+            <w:proofErr w:type="spellStart"/>
+            <w:r>
+              <w:rPr>
+                <w:i/>
+                <w:iCs/>
+                <w:color w:val="4F81BD" w:themeColor="accent1"/>
+              </w:rPr>
+              <w:t>Manager_Name</w:t>
+            </w:r>
+            <w:proofErr w:type="spellEnd"/>
+            <w:r>
+              <w:rPr>
+                <w:i/>
+                <w:iCs/>
+                <w:color w:val="4F81BD" w:themeColor="accent1"/>
+              </w:rPr>
+              <w:t xml:space="preserve">, </w:t>
+            </w:r>
+            <w:proofErr w:type="spellStart"/>
+            <w:r>
+              <w:rPr>
+                <w:i/>
+                <w:iCs/>
+                <w:color w:val="4F81BD" w:themeColor="accent1"/>
+              </w:rPr>
+              <w:t>e.Name</w:t>
+            </w:r>
+            <w:proofErr w:type="spellEnd"/>
+            <w:r>
+              <w:rPr>
+                <w:i/>
+                <w:iCs/>
+                <w:color w:val="4F81BD" w:themeColor="accent1"/>
+              </w:rPr>
+              <w:t xml:space="preserve"> </w:t>
+            </w:r>
+            <w:r>
+              <w:rPr>
+                <w:i/>
+                <w:iCs/>
+                <w:color w:val="000000" w:themeColor="text1"/>
+              </w:rPr>
+              <w:t xml:space="preserve">AS </w:t>
+            </w:r>
+            <w:proofErr w:type="spellStart"/>
+            <w:r>
+              <w:rPr>
+                <w:i/>
+                <w:iCs/>
+                <w:color w:val="4F81BD" w:themeColor="accent1"/>
+              </w:rPr>
+              <w:t>Employee_Name</w:t>
+            </w:r>
+            <w:proofErr w:type="spellEnd"/>
+            <w:r>
+              <w:rPr>
+                <w:i/>
+                <w:iCs/>
+                <w:color w:val="4F81BD" w:themeColor="accent1"/>
+              </w:rPr>
+              <w:t xml:space="preserve">, </w:t>
+            </w:r>
+            <w:proofErr w:type="spellStart"/>
+            <w:r>
+              <w:rPr>
+                <w:i/>
+                <w:iCs/>
+                <w:color w:val="4F81BD" w:themeColor="accent1"/>
+              </w:rPr>
+              <w:t>e.Employee_ID</w:t>
+            </w:r>
+            <w:proofErr w:type="spellEnd"/>
+            <w:r>
+              <w:rPr>
+                <w:i/>
+                <w:iCs/>
+                <w:color w:val="4F81BD" w:themeColor="accent1"/>
+              </w:rPr>
+              <w:t xml:space="preserve">, </w:t>
+            </w:r>
+            <w:proofErr w:type="spellStart"/>
+            <w:r>
+              <w:rPr>
+                <w:i/>
+                <w:iCs/>
+                <w:color w:val="4F81BD" w:themeColor="accent1"/>
+              </w:rPr>
+              <w:t>e.Work_Hours</w:t>
+            </w:r>
+            <w:proofErr w:type="spellEnd"/>
+          </w:p>
+          <w:p>
+            <w:pPr>
+              <w:rPr>
+                <w:i/>
+                <w:iCs/>
+                <w:color w:val="4F81BD" w:themeColor="accent1"/>
+              </w:rPr>
+            </w:pPr>
+            <w:r>
+              <w:rPr>
+                <w:i/>
+                <w:iCs/>
+                <w:color w:val="000000" w:themeColor="text1"/>
+              </w:rPr>
+              <w:t xml:space="preserve">FROM </w:t>
+            </w:r>
+            <w:r>
+              <w:rPr>
+                <w:i/>
+                <w:iCs/>
+                <w:color w:val="4F81BD" w:themeColor="accent1"/>
+              </w:rPr>
+              <w:t>Department d</w:t>
+            </w:r>
+          </w:p>
+          <w:p>
+            <w:pPr>
+              <w:rPr>
+                <w:i/>
+                <w:iCs/>
+                <w:color w:val="4F81BD" w:themeColor="accent1"/>
+              </w:rPr>
+            </w:pPr>
+            <w:r>
+              <w:rPr>
+                <w:i/>
+                <w:iCs/>
+                <w:color w:val="000000" w:themeColor="text1"/>
+              </w:rPr>
+              <w:t xml:space="preserve">LEFT JOIN </w:t>
+            </w:r>
+            <w:r>
+              <w:rPr>
+                <w:i/>
+                <w:iCs/>
+                <w:color w:val="4F81BD" w:themeColor="accent1"/>
+              </w:rPr>
+              <w:t xml:space="preserve">Employees m </w:t>
+            </w:r>
+            <w:r>
+              <w:rPr>
+                <w:i/>
+                <w:iCs/>
+                <w:color w:val="000000" w:themeColor="text1"/>
+              </w:rPr>
+              <w:t xml:space="preserve">ON </w:t>
+            </w:r>
+            <w:proofErr w:type="spellStart"/>
+            <w:r>
+              <w:rPr>
+                <w:i/>
+                <w:iCs/>
+                <w:color w:val="4F81BD" w:themeColor="accent1"/>
+              </w:rPr>
+              <w:t>d.Manager_ID</w:t>
+            </w:r>
+            <w:proofErr w:type="spellEnd"/>
+            <w:r>
+              <w:rPr>
+                <w:i/>
+                <w:iCs/>
+                <w:color w:val="4F81BD" w:themeColor="accent1"/>
+              </w:rPr>
+              <w:t xml:space="preserve"> = </w:t>
+            </w:r>
+            <w:proofErr w:type="spellStart"/>
+            <w:r>
+              <w:rPr>
+                <w:i/>
+                <w:iCs/>
+                <w:color w:val="4F81BD" w:themeColor="accent1"/>
+              </w:rPr>
+              <w:t>m.Employee_ID</w:t>
+            </w:r>
+            <w:proofErr w:type="spellEnd"/>
+          </w:p>
+          <w:p>
+            <w:pPr>
+              <w:rPr>
+                <w:i/>
+                <w:iCs/>
+                <w:color w:val="4F81BD" w:themeColor="accent1"/>
+              </w:rPr>
+            </w:pPr>
+            <w:r>
+              <w:rPr>
+                <w:i/>
+                <w:iCs/>
+                <w:color w:val="000000" w:themeColor="text1"/>
+              </w:rPr>
+              <w:t xml:space="preserve">LEFT JOIN </w:t>
+            </w:r>
+            <w:r>
+              <w:rPr>
+                <w:i/>
+                <w:iCs/>
+                <w:color w:val="4F81BD" w:themeColor="accent1"/>
+              </w:rPr>
+              <w:t xml:space="preserve">Employees e </w:t>
+            </w:r>
+            <w:r>
+              <w:rPr>
+                <w:i/>
+                <w:iCs/>
+                <w:color w:val="000000" w:themeColor="text1"/>
+              </w:rPr>
+              <w:t xml:space="preserve">ON </w:t>
+            </w:r>
+            <w:proofErr w:type="spellStart"/>
+            <w:r>
+              <w:rPr>
+                <w:i/>
+                <w:iCs/>
+                <w:color w:val="4F81BD" w:themeColor="accent1"/>
+              </w:rPr>
+              <w:t>d.Dept_ID</w:t>
+            </w:r>
+            <w:proofErr w:type="spellEnd"/>
+            <w:r>
+              <w:rPr>
+                <w:i/>
+                <w:iCs/>
+                <w:color w:val="4F81BD" w:themeColor="accent1"/>
+              </w:rPr>
+              <w:t xml:space="preserve"> = </w:t>
+            </w:r>
+            <w:proofErr w:type="spellStart"/>
+            <w:r>
+              <w:rPr>
+                <w:i/>
+                <w:iCs/>
+                <w:color w:val="4F81BD" w:themeColor="accent1"/>
+              </w:rPr>
+              <w:t>e.Dept_ID</w:t>
+            </w:r>
+            <w:proofErr w:type="spellEnd"/>
+          </w:p>
+          <w:p>
+            <w:pPr>
+              <w:rPr>
+                <w:i/>
+                <w:iCs/>
+                <w:color w:val="4F81BD" w:themeColor="accent1"/>
+              </w:rPr>
+            </w:pPr>
+            <w:r>
+              <w:rPr>
+                <w:i/>
+                <w:iCs/>
+                <w:color w:val="000000" w:themeColor="text1"/>
+              </w:rPr>
+              <w:t xml:space="preserve">ORDER BY </w:t>
+            </w:r>
+            <w:proofErr w:type="spellStart"/>
+            <w:r>
+              <w:rPr>
+                <w:i/>
+                <w:iCs/>
+                <w:color w:val="4F81BD" w:themeColor="accent1"/>
+              </w:rPr>
+              <w:t>d.Dept_Name</w:t>
+            </w:r>
+            <w:proofErr w:type="spellEnd"/>
+            <w:r>
+              <w:rPr>
+                <w:i/>
+                <w:iCs/>
+                <w:color w:val="4F81BD" w:themeColor="accent1"/>
+              </w:rPr>
+              <w:t>;</w:t>
+            </w:r>
+          </w:p>
+        </w:tc>
+        <w:tc>
+          <w:tcPr>
+            <w:tcW w:w="4343" w:type="dxa"/>
+          </w:tcPr>
+          <w:p>
+            <w:pPr>
+              <w:rPr>
+                <w:i/>
+                <w:iCs/>
+                <w:color w:val="4F81BD" w:themeColor="accent1"/>
+              </w:rPr>
+            </w:pPr>
+            <w:r>
+              <w:t>-- 6. Department details such as its employees and manager</w:t>
+            </w:r>
+          </w:p>
+        </w:tc>
+      </w:tr>
+    </w:tbl>
+    <w:p/>
     <w:p/>
     <w:p>
       <w:pPr>
-        <w:pStyle w:val="Heading1"/>
+        <w:pStyle w:val="1"/>
         <w:jc w:val="both"/>
       </w:pPr>
       <w:bookmarkStart w:id="17" w:name="_Toc33350376"/>
@@ -12549,7 +14463,7 @@
     </w:p>
     <w:p>
       <w:pPr>
-        <w:pStyle w:val="ListParagraph"/>
+        <w:pStyle w:val="aa"/>
         <w:numPr>
           <w:ilvl w:val="0"/>
           <w:numId w:val="17"/>
@@ -12607,7 +14521,7 @@
     </w:p>
     <w:p>
       <w:pPr>
-        <w:pStyle w:val="ListParagraph"/>
+        <w:pStyle w:val="aa"/>
         <w:numPr>
           <w:ilvl w:val="1"/>
           <w:numId w:val="17"/>
@@ -12665,42 +14579,26 @@
           <w:sz w:val="24"/>
           <w:szCs w:val="24"/>
         </w:rPr>
-        <w:t xml:space="preserve">mary key is </w:t>
-      </w:r>
-      <w:proofErr w:type="gramStart"/>
+        <w:t xml:space="preserve">mary key is duplicate It should display </w:t>
+      </w:r>
       <w:r>
         <w:rPr>
           <w:sz w:val="24"/>
           <w:szCs w:val="24"/>
         </w:rPr>
-        <w:t>duplicate</w:t>
-      </w:r>
-      <w:proofErr w:type="gramEnd"/>
+        <w:t xml:space="preserve">an </w:t>
+      </w:r>
       <w:r>
         <w:rPr>
           <w:sz w:val="24"/>
           <w:szCs w:val="24"/>
         </w:rPr>
-        <w:t xml:space="preserve"> It should display </w:t>
-      </w:r>
-      <w:r>
-        <w:rPr>
-          <w:sz w:val="24"/>
-          <w:szCs w:val="24"/>
-        </w:rPr>
-        <w:t xml:space="preserve">an </w:t>
-      </w:r>
-      <w:r>
-        <w:rPr>
-          <w:sz w:val="24"/>
-          <w:szCs w:val="24"/>
-        </w:rPr>
         <w:t>error message)</w:t>
       </w:r>
     </w:p>
     <w:p>
       <w:pPr>
-        <w:pStyle w:val="ListParagraph"/>
+        <w:pStyle w:val="aa"/>
         <w:numPr>
           <w:ilvl w:val="1"/>
           <w:numId w:val="17"/>
@@ -12721,7 +14619,7 @@
     </w:p>
     <w:p>
       <w:pPr>
-        <w:pStyle w:val="ListParagraph"/>
+        <w:pStyle w:val="aa"/>
         <w:numPr>
           <w:ilvl w:val="1"/>
           <w:numId w:val="17"/>
@@ -12770,7 +14668,7 @@
     </w:p>
     <w:p>
       <w:pPr>
-        <w:pStyle w:val="ListParagraph"/>
+        <w:pStyle w:val="aa"/>
         <w:numPr>
           <w:ilvl w:val="1"/>
           <w:numId w:val="17"/>
@@ -12818,28 +14716,12 @@
           <w:sz w:val="24"/>
           <w:szCs w:val="24"/>
         </w:rPr>
-        <w:t xml:space="preserve">, Next, Previous </w:t>
-      </w:r>
-      <w:proofErr w:type="gramStart"/>
-      <w:r>
-        <w:rPr>
-          <w:sz w:val="24"/>
-          <w:szCs w:val="24"/>
-        </w:rPr>
-        <w:t>etc..</w:t>
-      </w:r>
-      <w:proofErr w:type="gramEnd"/>
-      <w:r>
-        <w:rPr>
-          <w:sz w:val="24"/>
-          <w:szCs w:val="24"/>
-        </w:rPr>
-        <w:t>)</w:t>
+        <w:t>, Next, Previous etc..)</w:t>
       </w:r>
     </w:p>
     <w:p>
       <w:pPr>
-        <w:pStyle w:val="ListParagraph"/>
+        <w:pStyle w:val="aa"/>
         <w:numPr>
           <w:ilvl w:val="0"/>
           <w:numId w:val="17"/>
@@ -12855,7 +14737,6 @@
           <w:sz w:val="24"/>
           <w:szCs w:val="24"/>
         </w:rPr>
-        <w:lastRenderedPageBreak/>
         <w:t>Implement</w:t>
       </w:r>
       <w:r>
@@ -12889,7 +14770,7 @@
     </w:p>
     <w:p>
       <w:pPr>
-        <w:pStyle w:val="ListParagraph"/>
+        <w:pStyle w:val="aa"/>
         <w:numPr>
           <w:ilvl w:val="0"/>
           <w:numId w:val="17"/>
@@ -12979,6 +14860,7 @@
           <w:iCs/>
           <w:color w:val="4F81BD" w:themeColor="accent1"/>
         </w:rPr>
+        <w:lastRenderedPageBreak/>
         <w:t xml:space="preserve">You should provide screenshots of the application in your report with </w:t>
       </w:r>
       <w:r>
@@ -13056,7 +14938,7 @@
     </w:p>
     <w:p>
       <w:pPr>
-        <w:pStyle w:val="ListParagraph"/>
+        <w:pStyle w:val="aa"/>
         <w:numPr>
           <w:ilvl w:val="0"/>
           <w:numId w:val="17"/>
@@ -13115,7 +14997,7 @@
     </w:p>
     <w:p>
       <w:pPr>
-        <w:pStyle w:val="ListParagraph"/>
+        <w:pStyle w:val="aa"/>
         <w:numPr>
           <w:ilvl w:val="0"/>
           <w:numId w:val="16"/>
@@ -13136,7 +15018,7 @@
     </w:p>
     <w:p>
       <w:pPr>
-        <w:pStyle w:val="ListParagraph"/>
+        <w:pStyle w:val="aa"/>
         <w:numPr>
           <w:ilvl w:val="0"/>
           <w:numId w:val="16"/>
@@ -13157,7 +15039,7 @@
     </w:p>
     <w:p>
       <w:pPr>
-        <w:pStyle w:val="ListParagraph"/>
+        <w:pStyle w:val="aa"/>
         <w:numPr>
           <w:ilvl w:val="0"/>
           <w:numId w:val="16"/>
@@ -13178,7 +15060,7 @@
     </w:p>
     <w:p>
       <w:pPr>
-        <w:pStyle w:val="ListParagraph"/>
+        <w:pStyle w:val="aa"/>
         <w:numPr>
           <w:ilvl w:val="0"/>
           <w:numId w:val="16"/>
@@ -13200,7 +15082,7 @@
     </w:p>
     <w:p>
       <w:pPr>
-        <w:pStyle w:val="ListParagraph"/>
+        <w:pStyle w:val="aa"/>
         <w:numPr>
           <w:ilvl w:val="0"/>
           <w:numId w:val="16"/>
@@ -13281,7 +15163,7 @@
     </w:p>
     <w:p>
       <w:pPr>
-        <w:pStyle w:val="ListParagraph"/>
+        <w:pStyle w:val="aa"/>
         <w:numPr>
           <w:ilvl w:val="0"/>
           <w:numId w:val="15"/>
@@ -13317,7 +15199,7 @@
     </w:p>
     <w:p>
       <w:pPr>
-        <w:pStyle w:val="ListParagraph"/>
+        <w:pStyle w:val="aa"/>
         <w:numPr>
           <w:ilvl w:val="0"/>
           <w:numId w:val="15"/>
@@ -13369,8 +15251,6 @@
     </w:p>
     <w:p>
       <w:pPr>
-        <w:shd w:val="clear" w:color="auto" w:fill="FFFFFF"/>
-        <w:spacing w:after="0" w:line="240" w:lineRule="auto"/>
         <w:rPr>
           <w:rFonts w:ascii="Calibri" w:eastAsia="Times New Roman" w:hAnsi="Calibri" w:cs="Calibri"/>
           <w:b/>
@@ -13391,6 +15271,34 @@
           <w:szCs w:val="48"/>
           <w:u w:val="single"/>
         </w:rPr>
+        <w:br w:type="page"/>
+      </w:r>
+    </w:p>
+    <w:p>
+      <w:pPr>
+        <w:shd w:val="clear" w:color="auto" w:fill="FFFFFF"/>
+        <w:spacing w:after="0" w:line="240" w:lineRule="auto"/>
+        <w:rPr>
+          <w:rFonts w:ascii="Calibri" w:eastAsia="Times New Roman" w:hAnsi="Calibri" w:cs="Calibri"/>
+          <w:b/>
+          <w:bCs/>
+          <w:color w:val="212121"/>
+          <w:sz w:val="48"/>
+          <w:szCs w:val="48"/>
+          <w:u w:val="single"/>
+        </w:rPr>
+      </w:pPr>
+      <w:r>
+        <w:rPr>
+          <w:rFonts w:ascii="Calibri" w:eastAsia="Times New Roman" w:hAnsi="Calibri" w:cs="Calibri"/>
+          <w:b/>
+          <w:bCs/>
+          <w:color w:val="212121"/>
+          <w:sz w:val="48"/>
+          <w:szCs w:val="48"/>
+          <w:u w:val="single"/>
+        </w:rPr>
+        <w:lastRenderedPageBreak/>
         <w:t>Tasks to do:</w:t>
       </w:r>
     </w:p>
@@ -13408,7 +15316,7 @@
     </w:p>
     <w:tbl>
       <w:tblPr>
-        <w:tblStyle w:val="TableGrid"/>
+        <w:tblStyle w:val="a7"/>
         <w:tblW w:w="0" w:type="auto"/>
         <w:tblLook w:val="04A0" w:firstRow="1" w:lastRow="0" w:firstColumn="1" w:lastColumn="0" w:noHBand="0" w:noVBand="1"/>
       </w:tblPr>
@@ -14178,7 +16086,8 @@
               <w:jc w:val="center"/>
               <w:rPr>
                 <w:rFonts w:ascii="Calibri" w:hAnsi="Calibri" w:cs="Calibri"/>
-                <w:color w:val="212121"/>
+                <w:strike/>
+                <w:color w:val="EE0000"/>
                 <w:sz w:val="32"/>
                 <w:szCs w:val="32"/>
               </w:rPr>
@@ -14186,7 +16095,8 @@
             <w:r>
               <w:rPr>
                 <w:rFonts w:ascii="Calibri" w:hAnsi="Calibri" w:cs="Calibri"/>
-                <w:color w:val="212121"/>
+                <w:strike/>
+                <w:color w:val="EE0000"/>
                 <w:sz w:val="32"/>
                 <w:szCs w:val="32"/>
               </w:rPr>
@@ -14202,7 +16112,8 @@
             <w:pPr>
               <w:rPr>
                 <w:rFonts w:ascii="Calibri" w:hAnsi="Calibri" w:cs="Calibri"/>
-                <w:color w:val="212121"/>
+                <w:strike/>
+                <w:color w:val="EE0000"/>
                 <w:sz w:val="32"/>
                 <w:szCs w:val="32"/>
               </w:rPr>
@@ -14210,7 +16121,8 @@
             <w:r>
               <w:rPr>
                 <w:rFonts w:ascii="Calibri" w:hAnsi="Calibri" w:cs="Calibri"/>
-                <w:color w:val="212121"/>
+                <w:strike/>
+                <w:color w:val="EE0000"/>
                 <w:sz w:val="32"/>
                 <w:szCs w:val="32"/>
               </w:rPr>
@@ -14226,6 +16138,7 @@
             <w:pPr>
               <w:rPr>
                 <w:rFonts w:ascii="Calibri" w:hAnsi="Calibri" w:cs="Calibri"/>
+                <w:strike/>
                 <w:color w:val="212121"/>
                 <w:sz w:val="28"/>
                 <w:szCs w:val="28"/>
@@ -14235,6 +16148,7 @@
             <w:r>
               <w:rPr>
                 <w:rFonts w:ascii="Calibri" w:hAnsi="Calibri" w:cs="Calibri"/>
+                <w:strike/>
                 <w:color w:val="212121"/>
                 <w:sz w:val="28"/>
                 <w:szCs w:val="28"/>
@@ -14396,19 +16310,8 @@
                 <w:sz w:val="24"/>
                 <w:szCs w:val="24"/>
               </w:rPr>
-              <w:t xml:space="preserve">SQL Queries for Retrial of data for report (Complexity like using joins </w:t>
-            </w:r>
-            <w:proofErr w:type="gramStart"/>
-            <w:r>
-              <w:rPr>
-                <w:rFonts w:ascii="Calibri" w:hAnsi="Calibri" w:cs="Calibri"/>
-                <w:color w:val="212121"/>
-                <w:sz w:val="24"/>
-                <w:szCs w:val="24"/>
-              </w:rPr>
-              <w:t>etc. )</w:t>
-            </w:r>
-            <w:proofErr w:type="gramEnd"/>
+              <w:t>SQL Queries for Retrial of data for report (Complexity like using joins etc. )</w:t>
+            </w:r>
           </w:p>
         </w:tc>
         <w:tc>
@@ -14468,6 +16371,16 @@
                 <w:szCs w:val="32"/>
               </w:rPr>
             </w:pPr>
+            <w:r>
+              <w:rPr>
+                <w:rFonts w:ascii="Segoe UI Emoji" w:hAnsi="Segoe UI Emoji" w:cs="Segoe UI Emoji"/>
+                <w:color w:val="212121"/>
+                <w:sz w:val="32"/>
+                <w:szCs w:val="32"/>
+                <w:lang w:bidi="ar-SA"/>
+              </w:rPr>
+              <w:t>✅</w:t>
+            </w:r>
           </w:p>
         </w:tc>
       </w:tr>
@@ -14481,7 +16394,8 @@
               <w:jc w:val="center"/>
               <w:rPr>
                 <w:rFonts w:ascii="Calibri" w:hAnsi="Calibri" w:cs="Calibri"/>
-                <w:color w:val="212121"/>
+                <w:strike/>
+                <w:color w:val="EE0000"/>
                 <w:sz w:val="32"/>
                 <w:szCs w:val="32"/>
               </w:rPr>
@@ -14489,7 +16403,8 @@
             <w:r>
               <w:rPr>
                 <w:rFonts w:ascii="Calibri" w:hAnsi="Calibri" w:cs="Calibri"/>
-                <w:color w:val="212121"/>
+                <w:strike/>
+                <w:color w:val="EE0000"/>
                 <w:sz w:val="32"/>
                 <w:szCs w:val="32"/>
               </w:rPr>
@@ -14505,7 +16420,8 @@
             <w:pPr>
               <w:rPr>
                 <w:rFonts w:ascii="Calibri" w:hAnsi="Calibri" w:cs="Calibri"/>
-                <w:color w:val="212121"/>
+                <w:strike/>
+                <w:color w:val="EE0000"/>
                 <w:sz w:val="32"/>
                 <w:szCs w:val="32"/>
               </w:rPr>
@@ -14513,7 +16429,8 @@
             <w:r>
               <w:rPr>
                 <w:rFonts w:ascii="Calibri" w:hAnsi="Calibri" w:cs="Calibri"/>
-                <w:color w:val="212121"/>
+                <w:strike/>
+                <w:color w:val="EE0000"/>
                 <w:sz w:val="32"/>
                 <w:szCs w:val="32"/>
               </w:rPr>
@@ -14529,6 +16446,7 @@
             <w:pPr>
               <w:rPr>
                 <w:rFonts w:ascii="Calibri" w:hAnsi="Calibri" w:cs="Calibri"/>
+                <w:strike/>
                 <w:color w:val="212121"/>
                 <w:sz w:val="28"/>
                 <w:szCs w:val="28"/>
@@ -14537,6 +16455,7 @@
             <w:r>
               <w:rPr>
                 <w:rFonts w:ascii="Calibri" w:hAnsi="Calibri" w:cs="Calibri"/>
+                <w:strike/>
                 <w:color w:val="212121"/>
                 <w:sz w:val="28"/>
                 <w:szCs w:val="28"/>
@@ -14589,7 +16508,8 @@
               <w:jc w:val="center"/>
               <w:rPr>
                 <w:rFonts w:ascii="Calibri" w:hAnsi="Calibri" w:cs="Calibri"/>
-                <w:color w:val="212121"/>
+                <w:strike/>
+                <w:color w:val="EE0000"/>
                 <w:sz w:val="32"/>
                 <w:szCs w:val="32"/>
               </w:rPr>
@@ -14597,7 +16517,8 @@
             <w:r>
               <w:rPr>
                 <w:rFonts w:ascii="Calibri" w:hAnsi="Calibri" w:cs="Calibri"/>
-                <w:color w:val="212121"/>
+                <w:strike/>
+                <w:color w:val="EE0000"/>
                 <w:sz w:val="32"/>
                 <w:szCs w:val="32"/>
               </w:rPr>
@@ -14613,7 +16534,8 @@
             <w:pPr>
               <w:rPr>
                 <w:rFonts w:ascii="Calibri" w:hAnsi="Calibri" w:cs="Calibri"/>
-                <w:color w:val="212121"/>
+                <w:strike/>
+                <w:color w:val="EE0000"/>
                 <w:sz w:val="32"/>
                 <w:szCs w:val="32"/>
               </w:rPr>
@@ -14621,7 +16543,8 @@
             <w:r>
               <w:rPr>
                 <w:rFonts w:ascii="Calibri" w:hAnsi="Calibri" w:cs="Calibri"/>
-                <w:color w:val="212121"/>
+                <w:strike/>
+                <w:color w:val="EE0000"/>
                 <w:sz w:val="32"/>
                 <w:szCs w:val="32"/>
               </w:rPr>
@@ -14637,6 +16560,7 @@
             <w:pPr>
               <w:rPr>
                 <w:rFonts w:ascii="Calibri" w:hAnsi="Calibri" w:cs="Calibri"/>
+                <w:strike/>
                 <w:color w:val="212121"/>
                 <w:sz w:val="28"/>
                 <w:szCs w:val="28"/>
@@ -14646,6 +16570,7 @@
             <w:r>
               <w:rPr>
                 <w:rFonts w:ascii="Calibri" w:hAnsi="Calibri" w:cs="Calibri"/>
+                <w:strike/>
                 <w:color w:val="212121"/>
                 <w:sz w:val="28"/>
                 <w:szCs w:val="28"/>
@@ -14723,7 +16648,6 @@
                 <w:sz w:val="32"/>
                 <w:szCs w:val="32"/>
               </w:rPr>
-              <w:lastRenderedPageBreak/>
               <w:t>T9</w:t>
             </w:r>
           </w:p>
@@ -14763,7 +16687,6 @@
                 <w:szCs w:val="32"/>
                 <w:lang w:bidi="ar-SA"/>
               </w:rPr>
-              <w:lastRenderedPageBreak/>
               <w:t xml:space="preserve">Physical </w:t>
             </w:r>
             <w:r>
@@ -14809,7 +16732,6 @@
                 <w:sz w:val="28"/>
                 <w:szCs w:val="28"/>
               </w:rPr>
-              <w:lastRenderedPageBreak/>
               <w:t>Alkhars</w:t>
             </w:r>
             <w:proofErr w:type="spellEnd"/>
@@ -15351,7 +17273,7 @@
     <w:sdtContent>
       <w:p>
         <w:pPr>
-          <w:pStyle w:val="Footer"/>
+          <w:pStyle w:val="a6"/>
           <w:jc w:val="center"/>
         </w:pPr>
         <w:r>
@@ -15380,7 +17302,7 @@
   </w:sdt>
   <w:p>
     <w:pPr>
-      <w:pStyle w:val="Footer"/>
+      <w:pStyle w:val="a6"/>
     </w:pPr>
   </w:p>
 </w:ftr>
@@ -16334,7 +18256,7 @@
     <w:lvl w:ilvl="0" w:tplc="9EB6247C">
       <w:start w:val="1"/>
       <w:numFmt w:val="decimal"/>
-      <w:pStyle w:val="Heading1"/>
+      <w:pStyle w:val="1"/>
       <w:lvlText w:val="%1."/>
       <w:lvlJc w:val="left"/>
       <w:pPr>
@@ -16878,16 +18800,16 @@
     <w:lsdException w:name="Unresolved Mention" w:semiHidden="1" w:unhideWhenUsed="1"/>
     <w:lsdException w:name="Smart Link" w:semiHidden="1" w:unhideWhenUsed="1"/>
   </w:latentStyles>
-  <w:style w:type="paragraph" w:default="1" w:styleId="Normal">
+  <w:style w:type="paragraph" w:default="1" w:styleId="a">
     <w:name w:val="Normal"/>
     <w:qFormat/>
     <w:rsid w:val="00B23C93"/>
   </w:style>
-  <w:style w:type="paragraph" w:styleId="Heading1">
+  <w:style w:type="paragraph" w:styleId="1">
     <w:name w:val="heading 1"/>
-    <w:basedOn w:val="Normal"/>
-    <w:next w:val="Normal"/>
-    <w:link w:val="Heading1Char"/>
+    <w:basedOn w:val="a"/>
+    <w:next w:val="a"/>
+    <w:link w:val="1Char"/>
     <w:uiPriority w:val="9"/>
     <w:qFormat/>
     <w:rsid w:val="0011377B"/>
@@ -16909,11 +18831,11 @@
       <w:szCs w:val="28"/>
     </w:rPr>
   </w:style>
-  <w:style w:type="paragraph" w:styleId="Heading2">
+  <w:style w:type="paragraph" w:styleId="2">
     <w:name w:val="heading 2"/>
-    <w:basedOn w:val="Normal"/>
-    <w:next w:val="Normal"/>
-    <w:link w:val="Heading2Char"/>
+    <w:basedOn w:val="a"/>
+    <w:next w:val="a"/>
+    <w:link w:val="2Char"/>
     <w:uiPriority w:val="9"/>
     <w:unhideWhenUsed/>
     <w:qFormat/>
@@ -16933,11 +18855,11 @@
       <w:szCs w:val="26"/>
     </w:rPr>
   </w:style>
-  <w:style w:type="paragraph" w:styleId="Heading3">
+  <w:style w:type="paragraph" w:styleId="3">
     <w:name w:val="heading 3"/>
-    <w:basedOn w:val="Normal"/>
-    <w:next w:val="Normal"/>
-    <w:link w:val="Heading3Char"/>
+    <w:basedOn w:val="a"/>
+    <w:next w:val="a"/>
+    <w:link w:val="3Char"/>
     <w:uiPriority w:val="9"/>
     <w:semiHidden/>
     <w:unhideWhenUsed/>
@@ -16956,13 +18878,13 @@
       <w:szCs w:val="24"/>
     </w:rPr>
   </w:style>
-  <w:style w:type="character" w:default="1" w:styleId="DefaultParagraphFont">
+  <w:style w:type="character" w:default="1" w:styleId="a0">
     <w:name w:val="Default Paragraph Font"/>
     <w:uiPriority w:val="1"/>
     <w:semiHidden/>
     <w:unhideWhenUsed/>
   </w:style>
-  <w:style w:type="table" w:default="1" w:styleId="TableNormal">
+  <w:style w:type="table" w:default="1" w:styleId="a1">
     <w:name w:val="Normal Table"/>
     <w:uiPriority w:val="99"/>
     <w:semiHidden/>
@@ -16977,17 +18899,17 @@
       </w:tblCellMar>
     </w:tblPr>
   </w:style>
-  <w:style w:type="numbering" w:default="1" w:styleId="NoList">
+  <w:style w:type="numbering" w:default="1" w:styleId="a2">
     <w:name w:val="No List"/>
     <w:uiPriority w:val="99"/>
     <w:semiHidden/>
     <w:unhideWhenUsed/>
   </w:style>
-  <w:style w:type="paragraph" w:styleId="Title">
+  <w:style w:type="paragraph" w:styleId="a3">
     <w:name w:val="Title"/>
-    <w:basedOn w:val="Normal"/>
-    <w:next w:val="Normal"/>
-    <w:link w:val="TitleChar"/>
+    <w:basedOn w:val="a"/>
+    <w:next w:val="a"/>
+    <w:link w:val="Char"/>
     <w:uiPriority w:val="10"/>
     <w:qFormat/>
     <w:rsid w:val="00043A18"/>
@@ -17007,10 +18929,10 @@
       <w:szCs w:val="52"/>
     </w:rPr>
   </w:style>
-  <w:style w:type="character" w:customStyle="1" w:styleId="TitleChar">
-    <w:name w:val="Title Char"/>
-    <w:basedOn w:val="DefaultParagraphFont"/>
-    <w:link w:val="Title"/>
+  <w:style w:type="character" w:customStyle="1" w:styleId="Char">
+    <w:name w:val="العنوان Char"/>
+    <w:basedOn w:val="a0"/>
+    <w:link w:val="a3"/>
     <w:uiPriority w:val="10"/>
     <w:rsid w:val="00043A18"/>
     <w:rPr>
@@ -17022,11 +18944,11 @@
       <w:szCs w:val="52"/>
     </w:rPr>
   </w:style>
-  <w:style w:type="paragraph" w:styleId="Subtitle">
+  <w:style w:type="paragraph" w:styleId="a4">
     <w:name w:val="Subtitle"/>
-    <w:basedOn w:val="Normal"/>
-    <w:next w:val="Normal"/>
-    <w:link w:val="SubtitleChar"/>
+    <w:basedOn w:val="a"/>
+    <w:next w:val="a"/>
+    <w:link w:val="Char0"/>
     <w:uiPriority w:val="11"/>
     <w:qFormat/>
     <w:rsid w:val="00043A18"/>
@@ -17045,10 +18967,10 @@
       <w:szCs w:val="24"/>
     </w:rPr>
   </w:style>
-  <w:style w:type="character" w:customStyle="1" w:styleId="SubtitleChar">
-    <w:name w:val="Subtitle Char"/>
-    <w:basedOn w:val="DefaultParagraphFont"/>
-    <w:link w:val="Subtitle"/>
+  <w:style w:type="character" w:customStyle="1" w:styleId="Char0">
+    <w:name w:val="عنوان فرعي Char"/>
+    <w:basedOn w:val="a0"/>
+    <w:link w:val="a4"/>
     <w:uiPriority w:val="11"/>
     <w:rsid w:val="00043A18"/>
     <w:rPr>
@@ -17061,10 +18983,10 @@
       <w:szCs w:val="24"/>
     </w:rPr>
   </w:style>
-  <w:style w:type="character" w:customStyle="1" w:styleId="Heading1Char">
-    <w:name w:val="Heading 1 Char"/>
-    <w:basedOn w:val="DefaultParagraphFont"/>
-    <w:link w:val="Heading1"/>
+  <w:style w:type="character" w:customStyle="1" w:styleId="1Char">
+    <w:name w:val="العنوان 1 Char"/>
+    <w:basedOn w:val="a0"/>
+    <w:link w:val="1"/>
     <w:uiPriority w:val="9"/>
     <w:rsid w:val="0011377B"/>
     <w:rPr>
@@ -17076,10 +18998,10 @@
       <w:szCs w:val="28"/>
     </w:rPr>
   </w:style>
-  <w:style w:type="character" w:customStyle="1" w:styleId="Heading2Char">
-    <w:name w:val="Heading 2 Char"/>
-    <w:basedOn w:val="DefaultParagraphFont"/>
-    <w:link w:val="Heading2"/>
+  <w:style w:type="character" w:customStyle="1" w:styleId="2Char">
+    <w:name w:val="عنوان 2 Char"/>
+    <w:basedOn w:val="a0"/>
+    <w:link w:val="2"/>
     <w:uiPriority w:val="9"/>
     <w:rsid w:val="00043A18"/>
     <w:rPr>
@@ -17093,7 +19015,7 @@
   </w:style>
   <w:style w:type="character" w:styleId="Hyperlink">
     <w:name w:val="Hyperlink"/>
-    <w:basedOn w:val="DefaultParagraphFont"/>
+    <w:basedOn w:val="a0"/>
     <w:uiPriority w:val="99"/>
     <w:unhideWhenUsed/>
     <w:rsid w:val="00043A18"/>
@@ -17102,10 +19024,10 @@
       <w:u w:val="single"/>
     </w:rPr>
   </w:style>
-  <w:style w:type="paragraph" w:styleId="Header">
+  <w:style w:type="paragraph" w:styleId="a5">
     <w:name w:val="header"/>
-    <w:basedOn w:val="Normal"/>
-    <w:link w:val="HeaderChar"/>
+    <w:basedOn w:val="a"/>
+    <w:link w:val="Char1"/>
     <w:uiPriority w:val="99"/>
     <w:unhideWhenUsed/>
     <w:rsid w:val="000E636C"/>
@@ -17117,17 +19039,17 @@
       <w:spacing w:after="0" w:line="240" w:lineRule="auto"/>
     </w:pPr>
   </w:style>
-  <w:style w:type="character" w:customStyle="1" w:styleId="HeaderChar">
-    <w:name w:val="Header Char"/>
-    <w:basedOn w:val="DefaultParagraphFont"/>
-    <w:link w:val="Header"/>
+  <w:style w:type="character" w:customStyle="1" w:styleId="Char1">
+    <w:name w:val="رأس الصفحة Char"/>
+    <w:basedOn w:val="a0"/>
+    <w:link w:val="a5"/>
     <w:uiPriority w:val="99"/>
     <w:rsid w:val="000E636C"/>
   </w:style>
-  <w:style w:type="paragraph" w:styleId="Footer">
+  <w:style w:type="paragraph" w:styleId="a6">
     <w:name w:val="footer"/>
-    <w:basedOn w:val="Normal"/>
-    <w:link w:val="FooterChar"/>
+    <w:basedOn w:val="a"/>
+    <w:link w:val="Char2"/>
     <w:uiPriority w:val="99"/>
     <w:unhideWhenUsed/>
     <w:rsid w:val="000E636C"/>
@@ -17139,16 +19061,16 @@
       <w:spacing w:after="0" w:line="240" w:lineRule="auto"/>
     </w:pPr>
   </w:style>
-  <w:style w:type="character" w:customStyle="1" w:styleId="FooterChar">
-    <w:name w:val="Footer Char"/>
-    <w:basedOn w:val="DefaultParagraphFont"/>
-    <w:link w:val="Footer"/>
+  <w:style w:type="character" w:customStyle="1" w:styleId="Char2">
+    <w:name w:val="تذييل الصفحة Char"/>
+    <w:basedOn w:val="a0"/>
+    <w:link w:val="a6"/>
     <w:uiPriority w:val="99"/>
     <w:rsid w:val="000E636C"/>
   </w:style>
-  <w:style w:type="table" w:styleId="TableGrid">
+  <w:style w:type="table" w:styleId="a7">
     <w:name w:val="Table Grid"/>
-    <w:basedOn w:val="TableNormal"/>
+    <w:basedOn w:val="a1"/>
     <w:uiPriority w:val="39"/>
     <w:rsid w:val="005449C2"/>
     <w:pPr>
@@ -17171,10 +19093,10 @@
       </w:tblBorders>
     </w:tblPr>
   </w:style>
-  <w:style w:type="paragraph" w:styleId="TOCHeading">
+  <w:style w:type="paragraph" w:styleId="a8">
     <w:name w:val="TOC Heading"/>
-    <w:basedOn w:val="Heading1"/>
-    <w:next w:val="Normal"/>
+    <w:basedOn w:val="1"/>
+    <w:next w:val="a"/>
     <w:uiPriority w:val="39"/>
     <w:unhideWhenUsed/>
     <w:qFormat/>
@@ -17186,10 +19108,10 @@
       <w:lang w:eastAsia="ja-JP"/>
     </w:rPr>
   </w:style>
-  <w:style w:type="paragraph" w:styleId="TOC1">
+  <w:style w:type="paragraph" w:styleId="10">
     <w:name w:val="toc 1"/>
-    <w:basedOn w:val="Normal"/>
-    <w:next w:val="Normal"/>
+    <w:basedOn w:val="a"/>
+    <w:next w:val="a"/>
     <w:autoRedefine/>
     <w:uiPriority w:val="39"/>
     <w:unhideWhenUsed/>
@@ -17198,10 +19120,10 @@
       <w:spacing w:after="100"/>
     </w:pPr>
   </w:style>
-  <w:style w:type="paragraph" w:styleId="TOC2">
+  <w:style w:type="paragraph" w:styleId="20">
     <w:name w:val="toc 2"/>
-    <w:basedOn w:val="Normal"/>
-    <w:next w:val="Normal"/>
+    <w:basedOn w:val="a"/>
+    <w:next w:val="a"/>
     <w:autoRedefine/>
     <w:uiPriority w:val="39"/>
     <w:unhideWhenUsed/>
@@ -17211,10 +19133,10 @@
       <w:ind w:left="220"/>
     </w:pPr>
   </w:style>
-  <w:style w:type="paragraph" w:styleId="BalloonText">
+  <w:style w:type="paragraph" w:styleId="a9">
     <w:name w:val="Balloon Text"/>
-    <w:basedOn w:val="Normal"/>
-    <w:link w:val="BalloonTextChar"/>
+    <w:basedOn w:val="a"/>
+    <w:link w:val="Char3"/>
     <w:uiPriority w:val="99"/>
     <w:semiHidden/>
     <w:unhideWhenUsed/>
@@ -17228,10 +19150,10 @@
       <w:szCs w:val="16"/>
     </w:rPr>
   </w:style>
-  <w:style w:type="character" w:customStyle="1" w:styleId="BalloonTextChar">
-    <w:name w:val="Balloon Text Char"/>
-    <w:basedOn w:val="DefaultParagraphFont"/>
-    <w:link w:val="BalloonText"/>
+  <w:style w:type="character" w:customStyle="1" w:styleId="Char3">
+    <w:name w:val="نص في بالون Char"/>
+    <w:basedOn w:val="a0"/>
+    <w:link w:val="a9"/>
     <w:uiPriority w:val="99"/>
     <w:semiHidden/>
     <w:rsid w:val="005449C2"/>
@@ -17243,7 +19165,7 @@
   </w:style>
   <w:style w:type="character" w:customStyle="1" w:styleId="Mention1">
     <w:name w:val="Mention1"/>
-    <w:basedOn w:val="DefaultParagraphFont"/>
+    <w:basedOn w:val="a0"/>
     <w:uiPriority w:val="99"/>
     <w:semiHidden/>
     <w:unhideWhenUsed/>
@@ -17253,10 +19175,10 @@
       <w:shd w:val="clear" w:color="auto" w:fill="E6E6E6"/>
     </w:rPr>
   </w:style>
-  <w:style w:type="character" w:customStyle="1" w:styleId="Heading3Char">
-    <w:name w:val="Heading 3 Char"/>
-    <w:basedOn w:val="DefaultParagraphFont"/>
-    <w:link w:val="Heading3"/>
+  <w:style w:type="character" w:customStyle="1" w:styleId="3Char">
+    <w:name w:val="عنوان 3 Char"/>
+    <w:basedOn w:val="a0"/>
+    <w:link w:val="3"/>
     <w:uiPriority w:val="9"/>
     <w:semiHidden/>
     <w:rsid w:val="00F42AE9"/>
@@ -17267,9 +19189,9 @@
       <w:szCs w:val="24"/>
     </w:rPr>
   </w:style>
-  <w:style w:type="paragraph" w:styleId="ListParagraph">
+  <w:style w:type="paragraph" w:styleId="aa">
     <w:name w:val="List Paragraph"/>
-    <w:basedOn w:val="Normal"/>
+    <w:basedOn w:val="a"/>
     <w:uiPriority w:val="34"/>
     <w:qFormat/>
     <w:rsid w:val="00E31A00"/>
@@ -17278,9 +19200,9 @@
       <w:contextualSpacing/>
     </w:pPr>
   </w:style>
-  <w:style w:type="paragraph" w:styleId="NormalWeb">
+  <w:style w:type="paragraph" w:styleId="ab">
     <w:name w:val="Normal (Web)"/>
-    <w:basedOn w:val="Normal"/>
+    <w:basedOn w:val="a"/>
     <w:uiPriority w:val="99"/>
     <w:unhideWhenUsed/>
     <w:rsid w:val="003A16BD"/>

</xml_diff>